<commit_message>
new stuffz for test
</commit_message>
<xml_diff>
--- a/docs/NEST.PH_Technical_Walkthrough.docx
+++ b/docs/NEST.PH_Technical_Walkthrough.docx
@@ -72,7 +72,7 @@
       <w:pPr>
         <w:pStyle w:val="Heading1"/>
       </w:pPr>
-      <w:bookmarkStart w:id="0" w:name="_Toc242127656"/>
+      <w:bookmarkStart w:id="0" w:name="_Toc242144154"/>
       <w:r>
         <w:lastRenderedPageBreak/>
         <w:t>Contents</w:t>
@@ -110,7 +110,7 @@
           <w:r>
             <w:fldChar w:fldCharType="separate"/>
           </w:r>
-          <w:hyperlink w:anchor="_Toc242127656" w:history="1">
+          <w:hyperlink w:anchor="_Toc242144154" w:history="1">
             <w:r>
               <w:rPr>
                 <w:rStyle w:val="Hyperlink"/>
@@ -134,7 +134,7 @@
               <w:rPr>
                 <w:noProof/>
               </w:rPr>
-              <w:instrText xml:space="preserve"> PAGEREF _Toc242127656 \h </w:instrText>
+              <w:instrText xml:space="preserve"> PAGEREF _Toc242144154 \h </w:instrText>
             </w:r>
             <w:r>
               <w:rPr>
@@ -176,7 +176,7 @@
               <w14:ligatures w14:val="standardContextual"/>
             </w:rPr>
           </w:pPr>
-          <w:hyperlink w:anchor="_Toc242127657" w:history="1">
+          <w:hyperlink w:anchor="_Toc242144155" w:history="1">
             <w:r>
               <w:rPr>
                 <w:rStyle w:val="Hyperlink"/>
@@ -200,7 +200,7 @@
               <w:rPr>
                 <w:noProof/>
               </w:rPr>
-              <w:instrText xml:space="preserve"> PAGEREF _Toc242127657 \h </w:instrText>
+              <w:instrText xml:space="preserve"> PAGEREF _Toc242144155 \h </w:instrText>
             </w:r>
             <w:r>
               <w:rPr>
@@ -242,7 +242,7 @@
               <w14:ligatures w14:val="standardContextual"/>
             </w:rPr>
           </w:pPr>
-          <w:hyperlink w:anchor="_Toc242127658" w:history="1">
+          <w:hyperlink w:anchor="_Toc242144156" w:history="1">
             <w:r>
               <w:rPr>
                 <w:rStyle w:val="Hyperlink"/>
@@ -266,7 +266,7 @@
               <w:rPr>
                 <w:noProof/>
               </w:rPr>
-              <w:instrText xml:space="preserve"> PAGEREF _Toc242127658 \h </w:instrText>
+              <w:instrText xml:space="preserve"> PAGEREF _Toc242144156 \h </w:instrText>
             </w:r>
             <w:r>
               <w:rPr>
@@ -308,7 +308,7 @@
               <w14:ligatures w14:val="standardContextual"/>
             </w:rPr>
           </w:pPr>
-          <w:hyperlink w:anchor="_Toc242127659" w:history="1">
+          <w:hyperlink w:anchor="_Toc242144157" w:history="1">
             <w:r>
               <w:rPr>
                 <w:rStyle w:val="Hyperlink"/>
@@ -332,7 +332,7 @@
               <w:rPr>
                 <w:noProof/>
               </w:rPr>
-              <w:instrText xml:space="preserve"> PAGEREF _Toc242127659 \h </w:instrText>
+              <w:instrText xml:space="preserve"> PAGEREF _Toc242144157 \h </w:instrText>
             </w:r>
             <w:r>
               <w:rPr>
@@ -374,7 +374,7 @@
               <w14:ligatures w14:val="standardContextual"/>
             </w:rPr>
           </w:pPr>
-          <w:hyperlink w:anchor="_Toc242127660" w:history="1">
+          <w:hyperlink w:anchor="_Toc242144158" w:history="1">
             <w:r>
               <w:rPr>
                 <w:rStyle w:val="Hyperlink"/>
@@ -398,7 +398,7 @@
               <w:rPr>
                 <w:noProof/>
               </w:rPr>
-              <w:instrText xml:space="preserve"> PAGEREF _Toc242127660 \h </w:instrText>
+              <w:instrText xml:space="preserve"> PAGEREF _Toc242144158 \h </w:instrText>
             </w:r>
             <w:r>
               <w:rPr>
@@ -440,7 +440,7 @@
               <w14:ligatures w14:val="standardContextual"/>
             </w:rPr>
           </w:pPr>
-          <w:hyperlink w:anchor="_Toc242127661" w:history="1">
+          <w:hyperlink w:anchor="_Toc242144159" w:history="1">
             <w:r>
               <w:rPr>
                 <w:rStyle w:val="Hyperlink"/>
@@ -464,7 +464,7 @@
               <w:rPr>
                 <w:noProof/>
               </w:rPr>
-              <w:instrText xml:space="preserve"> PAGEREF _Toc242127661 \h </w:instrText>
+              <w:instrText xml:space="preserve"> PAGEREF _Toc242144159 \h </w:instrText>
             </w:r>
             <w:r>
               <w:rPr>
@@ -506,7 +506,7 @@
               <w14:ligatures w14:val="standardContextual"/>
             </w:rPr>
           </w:pPr>
-          <w:hyperlink w:anchor="_Toc242127662" w:history="1">
+          <w:hyperlink w:anchor="_Toc242144160" w:history="1">
             <w:r>
               <w:rPr>
                 <w:rStyle w:val="Hyperlink"/>
@@ -530,7 +530,7 @@
               <w:rPr>
                 <w:noProof/>
               </w:rPr>
-              <w:instrText xml:space="preserve"> PAGEREF _Toc242127662 \h </w:instrText>
+              <w:instrText xml:space="preserve"> PAGEREF _Toc242144160 \h </w:instrText>
             </w:r>
             <w:r>
               <w:rPr>
@@ -572,7 +572,7 @@
               <w14:ligatures w14:val="standardContextual"/>
             </w:rPr>
           </w:pPr>
-          <w:hyperlink w:anchor="_Toc242127663" w:history="1">
+          <w:hyperlink w:anchor="_Toc242144161" w:history="1">
             <w:r>
               <w:rPr>
                 <w:rStyle w:val="Hyperlink"/>
@@ -596,7 +596,7 @@
               <w:rPr>
                 <w:noProof/>
               </w:rPr>
-              <w:instrText xml:space="preserve"> PAGEREF _Toc242127663 \h </w:instrText>
+              <w:instrText xml:space="preserve"> PAGEREF _Toc242144161 \h </w:instrText>
             </w:r>
             <w:r>
               <w:rPr>
@@ -638,7 +638,7 @@
               <w14:ligatures w14:val="standardContextual"/>
             </w:rPr>
           </w:pPr>
-          <w:hyperlink w:anchor="_Toc242127664" w:history="1">
+          <w:hyperlink w:anchor="_Toc242144162" w:history="1">
             <w:r>
               <w:rPr>
                 <w:rStyle w:val="Hyperlink"/>
@@ -662,7 +662,7 @@
               <w:rPr>
                 <w:noProof/>
               </w:rPr>
-              <w:instrText xml:space="preserve"> PAGEREF _Toc242127664 \h </w:instrText>
+              <w:instrText xml:space="preserve"> PAGEREF _Toc242144162 \h </w:instrText>
             </w:r>
             <w:r>
               <w:rPr>
@@ -704,7 +704,7 @@
               <w14:ligatures w14:val="standardContextual"/>
             </w:rPr>
           </w:pPr>
-          <w:hyperlink w:anchor="_Toc242127665" w:history="1">
+          <w:hyperlink w:anchor="_Toc242144163" w:history="1">
             <w:r>
               <w:rPr>
                 <w:rStyle w:val="Hyperlink"/>
@@ -728,7 +728,7 @@
               <w:rPr>
                 <w:noProof/>
               </w:rPr>
-              <w:instrText xml:space="preserve"> PAGEREF _Toc242127665 \h </w:instrText>
+              <w:instrText xml:space="preserve"> PAGEREF _Toc242144163 \h </w:instrText>
             </w:r>
             <w:r>
               <w:rPr>
@@ -770,7 +770,7 @@
               <w14:ligatures w14:val="standardContextual"/>
             </w:rPr>
           </w:pPr>
-          <w:hyperlink w:anchor="_Toc242127666" w:history="1">
+          <w:hyperlink w:anchor="_Toc242144164" w:history="1">
             <w:r>
               <w:rPr>
                 <w:rStyle w:val="Hyperlink"/>
@@ -794,7 +794,7 @@
               <w:rPr>
                 <w:noProof/>
               </w:rPr>
-              <w:instrText xml:space="preserve"> PAGEREF _Toc242127666 \h </w:instrText>
+              <w:instrText xml:space="preserve"> PAGEREF _Toc242144164 \h </w:instrText>
             </w:r>
             <w:r>
               <w:rPr>
@@ -836,7 +836,7 @@
               <w14:ligatures w14:val="standardContextual"/>
             </w:rPr>
           </w:pPr>
-          <w:hyperlink w:anchor="_Toc242127667" w:history="1">
+          <w:hyperlink w:anchor="_Toc242144165" w:history="1">
             <w:r>
               <w:rPr>
                 <w:rStyle w:val="Hyperlink"/>
@@ -860,7 +860,7 @@
               <w:rPr>
                 <w:noProof/>
               </w:rPr>
-              <w:instrText xml:space="preserve"> PAGEREF _Toc242127667 \h </w:instrText>
+              <w:instrText xml:space="preserve"> PAGEREF _Toc242144165 \h </w:instrText>
             </w:r>
             <w:r>
               <w:rPr>
@@ -902,7 +902,7 @@
               <w14:ligatures w14:val="standardContextual"/>
             </w:rPr>
           </w:pPr>
-          <w:hyperlink w:anchor="_Toc242127668" w:history="1">
+          <w:hyperlink w:anchor="_Toc242144166" w:history="1">
             <w:r>
               <w:rPr>
                 <w:rStyle w:val="Hyperlink"/>
@@ -926,7 +926,7 @@
               <w:rPr>
                 <w:noProof/>
               </w:rPr>
-              <w:instrText xml:space="preserve"> PAGEREF _Toc242127668 \h </w:instrText>
+              <w:instrText xml:space="preserve"> PAGEREF _Toc242144166 \h </w:instrText>
             </w:r>
             <w:r>
               <w:rPr>
@@ -968,7 +968,7 @@
               <w14:ligatures w14:val="standardContextual"/>
             </w:rPr>
           </w:pPr>
-          <w:hyperlink w:anchor="_Toc242127669" w:history="1">
+          <w:hyperlink w:anchor="_Toc242144167" w:history="1">
             <w:r>
               <w:rPr>
                 <w:rStyle w:val="Hyperlink"/>
@@ -992,7 +992,7 @@
               <w:rPr>
                 <w:noProof/>
               </w:rPr>
-              <w:instrText xml:space="preserve"> PAGEREF _Toc242127669 \h </w:instrText>
+              <w:instrText xml:space="preserve"> PAGEREF _Toc242144167 \h </w:instrText>
             </w:r>
             <w:r>
               <w:rPr>
@@ -1034,7 +1034,7 @@
               <w14:ligatures w14:val="standardContextual"/>
             </w:rPr>
           </w:pPr>
-          <w:hyperlink w:anchor="_Toc242127670" w:history="1">
+          <w:hyperlink w:anchor="_Toc242144168" w:history="1">
             <w:r>
               <w:rPr>
                 <w:rStyle w:val="Hyperlink"/>
@@ -1058,7 +1058,7 @@
               <w:rPr>
                 <w:noProof/>
               </w:rPr>
-              <w:instrText xml:space="preserve"> PAGEREF _Toc242127670 \h </w:instrText>
+              <w:instrText xml:space="preserve"> PAGEREF _Toc242144168 \h </w:instrText>
             </w:r>
             <w:r>
               <w:rPr>
@@ -1100,7 +1100,7 @@
               <w14:ligatures w14:val="standardContextual"/>
             </w:rPr>
           </w:pPr>
-          <w:hyperlink w:anchor="_Toc242127671" w:history="1">
+          <w:hyperlink w:anchor="_Toc242144169" w:history="1">
             <w:r>
               <w:rPr>
                 <w:rStyle w:val="Hyperlink"/>
@@ -1124,7 +1124,7 @@
               <w:rPr>
                 <w:noProof/>
               </w:rPr>
-              <w:instrText xml:space="preserve"> PAGEREF _Toc242127671 \h </w:instrText>
+              <w:instrText xml:space="preserve"> PAGEREF _Toc242144169 \h </w:instrText>
             </w:r>
             <w:r>
               <w:rPr>
@@ -1166,7 +1166,7 @@
               <w14:ligatures w14:val="standardContextual"/>
             </w:rPr>
           </w:pPr>
-          <w:hyperlink w:anchor="_Toc242127672" w:history="1">
+          <w:hyperlink w:anchor="_Toc242144170" w:history="1">
             <w:r>
               <w:rPr>
                 <w:rStyle w:val="Hyperlink"/>
@@ -1190,7 +1190,7 @@
               <w:rPr>
                 <w:noProof/>
               </w:rPr>
-              <w:instrText xml:space="preserve"> PAGEREF _Toc242127672 \h </w:instrText>
+              <w:instrText xml:space="preserve"> PAGEREF _Toc242144170 \h </w:instrText>
             </w:r>
             <w:r>
               <w:rPr>
@@ -1232,7 +1232,7 @@
               <w14:ligatures w14:val="standardContextual"/>
             </w:rPr>
           </w:pPr>
-          <w:hyperlink w:anchor="_Toc242127673" w:history="1">
+          <w:hyperlink w:anchor="_Toc242144171" w:history="1">
             <w:r>
               <w:rPr>
                 <w:rStyle w:val="Hyperlink"/>
@@ -1256,7 +1256,7 @@
               <w:rPr>
                 <w:noProof/>
               </w:rPr>
-              <w:instrText xml:space="preserve"> PAGEREF _Toc242127673 \h </w:instrText>
+              <w:instrText xml:space="preserve"> PAGEREF _Toc242144171 \h </w:instrText>
             </w:r>
             <w:r>
               <w:rPr>
@@ -1298,7 +1298,7 @@
               <w14:ligatures w14:val="standardContextual"/>
             </w:rPr>
           </w:pPr>
-          <w:hyperlink w:anchor="_Toc242127674" w:history="1">
+          <w:hyperlink w:anchor="_Toc242144172" w:history="1">
             <w:r>
               <w:rPr>
                 <w:rStyle w:val="Hyperlink"/>
@@ -1322,7 +1322,7 @@
               <w:rPr>
                 <w:noProof/>
               </w:rPr>
-              <w:instrText xml:space="preserve"> PAGEREF _Toc242127674 \h </w:instrText>
+              <w:instrText xml:space="preserve"> PAGEREF _Toc242144172 \h </w:instrText>
             </w:r>
             <w:r>
               <w:rPr>
@@ -1364,7 +1364,7 @@
               <w14:ligatures w14:val="standardContextual"/>
             </w:rPr>
           </w:pPr>
-          <w:hyperlink w:anchor="_Toc242127675" w:history="1">
+          <w:hyperlink w:anchor="_Toc242144173" w:history="1">
             <w:r>
               <w:rPr>
                 <w:rStyle w:val="Hyperlink"/>
@@ -1388,7 +1388,7 @@
               <w:rPr>
                 <w:noProof/>
               </w:rPr>
-              <w:instrText xml:space="preserve"> PAGEREF _Toc242127675 \h </w:instrText>
+              <w:instrText xml:space="preserve"> PAGEREF _Toc242144173 \h </w:instrText>
             </w:r>
             <w:r>
               <w:rPr>
@@ -1430,7 +1430,7 @@
               <w14:ligatures w14:val="standardContextual"/>
             </w:rPr>
           </w:pPr>
-          <w:hyperlink w:anchor="_Toc242127676" w:history="1">
+          <w:hyperlink w:anchor="_Toc242144174" w:history="1">
             <w:r>
               <w:rPr>
                 <w:rStyle w:val="Hyperlink"/>
@@ -1454,7 +1454,7 @@
               <w:rPr>
                 <w:noProof/>
               </w:rPr>
-              <w:instrText xml:space="preserve"> PAGEREF _Toc242127676 \h </w:instrText>
+              <w:instrText xml:space="preserve"> PAGEREF _Toc242144174 \h </w:instrText>
             </w:r>
             <w:r>
               <w:rPr>
@@ -1496,7 +1496,7 @@
               <w14:ligatures w14:val="standardContextual"/>
             </w:rPr>
           </w:pPr>
-          <w:hyperlink w:anchor="_Toc242127677" w:history="1">
+          <w:hyperlink w:anchor="_Toc242144175" w:history="1">
             <w:r>
               <w:rPr>
                 <w:rStyle w:val="Hyperlink"/>
@@ -1520,7 +1520,7 @@
               <w:rPr>
                 <w:noProof/>
               </w:rPr>
-              <w:instrText xml:space="preserve"> PAGEREF _Toc242127677 \h </w:instrText>
+              <w:instrText xml:space="preserve"> PAGEREF _Toc242144175 \h </w:instrText>
             </w:r>
             <w:r>
               <w:rPr>
@@ -1562,7 +1562,7 @@
               <w14:ligatures w14:val="standardContextual"/>
             </w:rPr>
           </w:pPr>
-          <w:hyperlink w:anchor="_Toc242127678" w:history="1">
+          <w:hyperlink w:anchor="_Toc242144176" w:history="1">
             <w:r>
               <w:rPr>
                 <w:rStyle w:val="Hyperlink"/>
@@ -1586,7 +1586,7 @@
               <w:rPr>
                 <w:noProof/>
               </w:rPr>
-              <w:instrText xml:space="preserve"> PAGEREF _Toc242127678 \h </w:instrText>
+              <w:instrText xml:space="preserve"> PAGEREF _Toc242144176 \h </w:instrText>
             </w:r>
             <w:r>
               <w:rPr>
@@ -1628,7 +1628,7 @@
               <w14:ligatures w14:val="standardContextual"/>
             </w:rPr>
           </w:pPr>
-          <w:hyperlink w:anchor="_Toc242127679" w:history="1">
+          <w:hyperlink w:anchor="_Toc242144177" w:history="1">
             <w:r>
               <w:rPr>
                 <w:rStyle w:val="Hyperlink"/>
@@ -1652,7 +1652,7 @@
               <w:rPr>
                 <w:noProof/>
               </w:rPr>
-              <w:instrText xml:space="preserve"> PAGEREF _Toc242127679 \h </w:instrText>
+              <w:instrText xml:space="preserve"> PAGEREF _Toc242144177 \h </w:instrText>
             </w:r>
             <w:r>
               <w:rPr>
@@ -1694,7 +1694,7 @@
               <w14:ligatures w14:val="standardContextual"/>
             </w:rPr>
           </w:pPr>
-          <w:hyperlink w:anchor="_Toc242127680" w:history="1">
+          <w:hyperlink w:anchor="_Toc242144178" w:history="1">
             <w:r>
               <w:rPr>
                 <w:rStyle w:val="Hyperlink"/>
@@ -1718,7 +1718,7 @@
               <w:rPr>
                 <w:noProof/>
               </w:rPr>
-              <w:instrText xml:space="preserve"> PAGEREF _Toc242127680 \h </w:instrText>
+              <w:instrText xml:space="preserve"> PAGEREF _Toc242144178 \h </w:instrText>
             </w:r>
             <w:r>
               <w:rPr>
@@ -1760,7 +1760,7 @@
               <w14:ligatures w14:val="standardContextual"/>
             </w:rPr>
           </w:pPr>
-          <w:hyperlink w:anchor="_Toc242127681" w:history="1">
+          <w:hyperlink w:anchor="_Toc242144179" w:history="1">
             <w:r>
               <w:rPr>
                 <w:rStyle w:val="Hyperlink"/>
@@ -1784,7 +1784,7 @@
               <w:rPr>
                 <w:noProof/>
               </w:rPr>
-              <w:instrText xml:space="preserve"> PAGEREF _Toc242127681 \h </w:instrText>
+              <w:instrText xml:space="preserve"> PAGEREF _Toc242144179 \h </w:instrText>
             </w:r>
             <w:r>
               <w:rPr>
@@ -1826,7 +1826,7 @@
               <w14:ligatures w14:val="standardContextual"/>
             </w:rPr>
           </w:pPr>
-          <w:hyperlink w:anchor="_Toc242127682" w:history="1">
+          <w:hyperlink w:anchor="_Toc242144180" w:history="1">
             <w:r>
               <w:rPr>
                 <w:rStyle w:val="Hyperlink"/>
@@ -1850,7 +1850,73 @@
               <w:rPr>
                 <w:noProof/>
               </w:rPr>
-              <w:instrText xml:space="preserve"> PAGEREF _Toc242127682 \h </w:instrText>
+              <w:instrText xml:space="preserve"> PAGEREF _Toc242144180 \h </w:instrText>
+            </w:r>
+            <w:r>
+              <w:rPr>
+                <w:noProof/>
+              </w:rPr>
+            </w:r>
+            <w:r>
+              <w:rPr>
+                <w:noProof/>
+              </w:rPr>
+              <w:fldChar w:fldCharType="separate"/>
+            </w:r>
+            <w:r>
+              <w:rPr>
+                <w:noProof/>
+              </w:rPr>
+              <w:t>15</w:t>
+            </w:r>
+            <w:r>
+              <w:rPr>
+                <w:noProof/>
+              </w:rPr>
+              <w:fldChar w:fldCharType="end"/>
+            </w:r>
+          </w:hyperlink>
+        </w:p>
+        <w:p>
+          <w:pPr>
+            <w:pStyle w:val="TOC2"/>
+            <w:tabs>
+              <w:tab w:val="right" w:leader="dot" w:pos="9350"/>
+            </w:tabs>
+            <w:rPr>
+              <w:rFonts w:asciiTheme="minorHAnsi" w:eastAsiaTheme="minorEastAsia" w:hAnsiTheme="minorHAnsi" w:cstheme="minorBidi"/>
+              <w:noProof/>
+              <w:kern w:val="2"/>
+              <w:sz w:val="24"/>
+              <w:szCs w:val="24"/>
+              <w14:ligatures w14:val="standardContextual"/>
+            </w:rPr>
+          </w:pPr>
+          <w:hyperlink w:anchor="_Toc242144181" w:history="1">
+            <w:r>
+              <w:rPr>
+                <w:rStyle w:val="Hyperlink"/>
+                <w:noProof/>
+              </w:rPr>
+              <w:t>Proration: mid-month move-in and move-out</w:t>
+            </w:r>
+            <w:r>
+              <w:rPr>
+                <w:noProof/>
+              </w:rPr>
+              <w:tab/>
+            </w:r>
+            <w:r>
+              <w:rPr>
+                <w:noProof/>
+              </w:rPr>
+              <w:fldChar w:fldCharType="begin"/>
+            </w:r>
+            <w:r>
+              <w:rPr>
+                <w:noProof/>
+              </w:rPr>
+              <w:instrText xml:space="preserve"> PAGEREF _Toc242144181 \h </w:instrText>
             </w:r>
             <w:r>
               <w:rPr>
@@ -1892,7 +1958,7 @@
               <w14:ligatures w14:val="standardContextual"/>
             </w:rPr>
           </w:pPr>
-          <w:hyperlink w:anchor="_Toc242127683" w:history="1">
+          <w:hyperlink w:anchor="_Toc242144182" w:history="1">
             <w:r>
               <w:rPr>
                 <w:rStyle w:val="Hyperlink"/>
@@ -1916,7 +1982,7 @@
               <w:rPr>
                 <w:noProof/>
               </w:rPr>
-              <w:instrText xml:space="preserve"> PAGEREF _Toc242127683 \h </w:instrText>
+              <w:instrText xml:space="preserve"> PAGEREF _Toc242144182 \h </w:instrText>
             </w:r>
             <w:r>
               <w:rPr>
@@ -1933,7 +1999,7 @@
               <w:rPr>
                 <w:noProof/>
               </w:rPr>
-              <w:t>17</w:t>
+              <w:t>18</w:t>
             </w:r>
             <w:r>
               <w:rPr>
@@ -1958,7 +2024,7 @@
               <w14:ligatures w14:val="standardContextual"/>
             </w:rPr>
           </w:pPr>
-          <w:hyperlink w:anchor="_Toc242127684" w:history="1">
+          <w:hyperlink w:anchor="_Toc242144183" w:history="1">
             <w:r>
               <w:rPr>
                 <w:rStyle w:val="Hyperlink"/>
@@ -1982,7 +2048,7 @@
               <w:rPr>
                 <w:noProof/>
               </w:rPr>
-              <w:instrText xml:space="preserve"> PAGEREF _Toc242127684 \h </w:instrText>
+              <w:instrText xml:space="preserve"> PAGEREF _Toc242144183 \h </w:instrText>
             </w:r>
             <w:r>
               <w:rPr>
@@ -1999,7 +2065,7 @@
               <w:rPr>
                 <w:noProof/>
               </w:rPr>
-              <w:t>17</w:t>
+              <w:t>18</w:t>
             </w:r>
             <w:r>
               <w:rPr>
@@ -2024,7 +2090,7 @@
               <w14:ligatures w14:val="standardContextual"/>
             </w:rPr>
           </w:pPr>
-          <w:hyperlink w:anchor="_Toc242127685" w:history="1">
+          <w:hyperlink w:anchor="_Toc242144184" w:history="1">
             <w:r>
               <w:rPr>
                 <w:rStyle w:val="Hyperlink"/>
@@ -2048,7 +2114,7 @@
               <w:rPr>
                 <w:noProof/>
               </w:rPr>
-              <w:instrText xml:space="preserve"> PAGEREF _Toc242127685 \h </w:instrText>
+              <w:instrText xml:space="preserve"> PAGEREF _Toc242144184 \h </w:instrText>
             </w:r>
             <w:r>
               <w:rPr>
@@ -2065,7 +2131,7 @@
               <w:rPr>
                 <w:noProof/>
               </w:rPr>
-              <w:t>17</w:t>
+              <w:t>18</w:t>
             </w:r>
             <w:r>
               <w:rPr>
@@ -2090,7 +2156,7 @@
               <w14:ligatures w14:val="standardContextual"/>
             </w:rPr>
           </w:pPr>
-          <w:hyperlink w:anchor="_Toc242127686" w:history="1">
+          <w:hyperlink w:anchor="_Toc242144185" w:history="1">
             <w:r>
               <w:rPr>
                 <w:rStyle w:val="Hyperlink"/>
@@ -2114,7 +2180,14 @@
               <w:rPr>
                 <w:noProof/>
               </w:rPr>
-              <w:instrText xml:space="preserve"> PAGEREF _Toc242127686 \h </w:instrText>
+              <w:instrText xml:space="preserve"> PAGEREF _Toc24214</w:instrText>
+            </w:r>
+            <w:r>
+              <w:rPr>
+                <w:noProof/>
+              </w:rPr>
+              <w:lastRenderedPageBreak/>
+              <w:instrText xml:space="preserve">4185 \h </w:instrText>
             </w:r>
             <w:r>
               <w:rPr>
@@ -2131,7 +2204,7 @@
               <w:rPr>
                 <w:noProof/>
               </w:rPr>
-              <w:t>18</w:t>
+              <w:t>19</w:t>
             </w:r>
             <w:r>
               <w:rPr>
@@ -2156,7 +2229,7 @@
               <w14:ligatures w14:val="standardContextual"/>
             </w:rPr>
           </w:pPr>
-          <w:hyperlink w:anchor="_Toc242127687" w:history="1">
+          <w:hyperlink w:anchor="_Toc242144186" w:history="1">
             <w:r>
               <w:rPr>
                 <w:rStyle w:val="Hyperlink"/>
@@ -2180,7 +2253,7 @@
               <w:rPr>
                 <w:noProof/>
               </w:rPr>
-              <w:instrText xml:space="preserve"> PAGEREF _Toc242127687 \h </w:instrText>
+              <w:instrText xml:space="preserve"> PAGEREF _Toc242144186 \h </w:instrText>
             </w:r>
             <w:r>
               <w:rPr>
@@ -2197,7 +2270,7 @@
               <w:rPr>
                 <w:noProof/>
               </w:rPr>
-              <w:t>18</w:t>
+              <w:t>19</w:t>
             </w:r>
             <w:r>
               <w:rPr>
@@ -2222,7 +2295,7 @@
               <w14:ligatures w14:val="standardContextual"/>
             </w:rPr>
           </w:pPr>
-          <w:hyperlink w:anchor="_Toc242127688" w:history="1">
+          <w:hyperlink w:anchor="_Toc242144187" w:history="1">
             <w:r>
               <w:rPr>
                 <w:rStyle w:val="Hyperlink"/>
@@ -2246,7 +2319,7 @@
               <w:rPr>
                 <w:noProof/>
               </w:rPr>
-              <w:instrText xml:space="preserve"> PAGEREF _Toc242127688 \h </w:instrText>
+              <w:instrText xml:space="preserve"> PAGEREF _Toc242144187 \h </w:instrText>
             </w:r>
             <w:r>
               <w:rPr>
@@ -2263,7 +2336,7 @@
               <w:rPr>
                 <w:noProof/>
               </w:rPr>
-              <w:t>18</w:t>
+              <w:t>19</w:t>
             </w:r>
             <w:r>
               <w:rPr>
@@ -2288,7 +2361,7 @@
               <w14:ligatures w14:val="standardContextual"/>
             </w:rPr>
           </w:pPr>
-          <w:hyperlink w:anchor="_Toc242127689" w:history="1">
+          <w:hyperlink w:anchor="_Toc242144188" w:history="1">
             <w:r>
               <w:rPr>
                 <w:rStyle w:val="Hyperlink"/>
@@ -2312,7 +2385,7 @@
               <w:rPr>
                 <w:noProof/>
               </w:rPr>
-              <w:instrText xml:space="preserve"> PAGEREF _Toc242127689 \h </w:instrText>
+              <w:instrText xml:space="preserve"> PAGEREF _Toc242144188 \h </w:instrText>
             </w:r>
             <w:r>
               <w:rPr>
@@ -2329,7 +2402,7 @@
               <w:rPr>
                 <w:noProof/>
               </w:rPr>
-              <w:t>19</w:t>
+              <w:t>20</w:t>
             </w:r>
             <w:r>
               <w:rPr>
@@ -2354,7 +2427,7 @@
               <w14:ligatures w14:val="standardContextual"/>
             </w:rPr>
           </w:pPr>
-          <w:hyperlink w:anchor="_Toc242127690" w:history="1">
+          <w:hyperlink w:anchor="_Toc242144189" w:history="1">
             <w:r>
               <w:rPr>
                 <w:rStyle w:val="Hyperlink"/>
@@ -2378,7 +2451,7 @@
               <w:rPr>
                 <w:noProof/>
               </w:rPr>
-              <w:instrText xml:space="preserve"> PAGEREF _Toc242127690 \h </w:instrText>
+              <w:instrText xml:space="preserve"> PAGEREF _Toc242144189 \h </w:instrText>
             </w:r>
             <w:r>
               <w:rPr>
@@ -2395,7 +2468,7 @@
               <w:rPr>
                 <w:noProof/>
               </w:rPr>
-              <w:t>19</w:t>
+              <w:t>20</w:t>
             </w:r>
             <w:r>
               <w:rPr>
@@ -2420,7 +2493,7 @@
               <w14:ligatures w14:val="standardContextual"/>
             </w:rPr>
           </w:pPr>
-          <w:hyperlink w:anchor="_Toc242127691" w:history="1">
+          <w:hyperlink w:anchor="_Toc242144190" w:history="1">
             <w:r>
               <w:rPr>
                 <w:rStyle w:val="Hyperlink"/>
@@ -2444,7 +2517,7 @@
               <w:rPr>
                 <w:noProof/>
               </w:rPr>
-              <w:instrText xml:space="preserve"> PAGEREF _Toc242127691 \h </w:instrText>
+              <w:instrText xml:space="preserve"> PAGEREF _Toc242144190 \h </w:instrText>
             </w:r>
             <w:r>
               <w:rPr>
@@ -2461,7 +2534,7 @@
               <w:rPr>
                 <w:noProof/>
               </w:rPr>
-              <w:t>19</w:t>
+              <w:t>20</w:t>
             </w:r>
             <w:r>
               <w:rPr>
@@ -2486,7 +2559,7 @@
               <w14:ligatures w14:val="standardContextual"/>
             </w:rPr>
           </w:pPr>
-          <w:hyperlink w:anchor="_Toc242127692" w:history="1">
+          <w:hyperlink w:anchor="_Toc242144191" w:history="1">
             <w:r>
               <w:rPr>
                 <w:rStyle w:val="Hyperlink"/>
@@ -2510,7 +2583,7 @@
               <w:rPr>
                 <w:noProof/>
               </w:rPr>
-              <w:instrText xml:space="preserve"> PAGEREF _Toc242127692 \h </w:instrText>
+              <w:instrText xml:space="preserve"> PAGEREF _Toc242144191 \h </w:instrText>
             </w:r>
             <w:r>
               <w:rPr>
@@ -2527,7 +2600,7 @@
               <w:rPr>
                 <w:noProof/>
               </w:rPr>
-              <w:t>21</w:t>
+              <w:t>22</w:t>
             </w:r>
             <w:r>
               <w:rPr>
@@ -2552,7 +2625,7 @@
               <w14:ligatures w14:val="standardContextual"/>
             </w:rPr>
           </w:pPr>
-          <w:hyperlink w:anchor="_Toc242127693" w:history="1">
+          <w:hyperlink w:anchor="_Toc242144192" w:history="1">
             <w:r>
               <w:rPr>
                 <w:rStyle w:val="Hyperlink"/>
@@ -2576,7 +2649,7 @@
               <w:rPr>
                 <w:noProof/>
               </w:rPr>
-              <w:instrText xml:space="preserve"> PAGEREF _Toc242127693 \h </w:instrText>
+              <w:instrText xml:space="preserve"> PAGEREF _Toc242144192 \h </w:instrText>
             </w:r>
             <w:r>
               <w:rPr>
@@ -2593,7 +2666,7 @@
               <w:rPr>
                 <w:noProof/>
               </w:rPr>
-              <w:t>21</w:t>
+              <w:t>22</w:t>
             </w:r>
             <w:r>
               <w:rPr>
@@ -2618,7 +2691,7 @@
               <w14:ligatures w14:val="standardContextual"/>
             </w:rPr>
           </w:pPr>
-          <w:hyperlink w:anchor="_Toc242127694" w:history="1">
+          <w:hyperlink w:anchor="_Toc242144193" w:history="1">
             <w:r>
               <w:rPr>
                 <w:rStyle w:val="Hyperlink"/>
@@ -2642,7 +2715,7 @@
               <w:rPr>
                 <w:noProof/>
               </w:rPr>
-              <w:instrText xml:space="preserve"> PAGEREF _Toc242127694 \h </w:instrText>
+              <w:instrText xml:space="preserve"> PAGEREF _Toc242144193 \h </w:instrText>
             </w:r>
             <w:r>
               <w:rPr>
@@ -2659,7 +2732,7 @@
               <w:rPr>
                 <w:noProof/>
               </w:rPr>
-              <w:t>21</w:t>
+              <w:t>22</w:t>
             </w:r>
             <w:r>
               <w:rPr>
@@ -2684,7 +2757,7 @@
               <w14:ligatures w14:val="standardContextual"/>
             </w:rPr>
           </w:pPr>
-          <w:hyperlink w:anchor="_Toc242127695" w:history="1">
+          <w:hyperlink w:anchor="_Toc242144194" w:history="1">
             <w:r>
               <w:rPr>
                 <w:rStyle w:val="Hyperlink"/>
@@ -2708,7 +2781,7 @@
               <w:rPr>
                 <w:noProof/>
               </w:rPr>
-              <w:instrText xml:space="preserve"> PAGEREF _Toc242127695 \h </w:instrText>
+              <w:instrText xml:space="preserve"> PAGEREF _Toc242144194 \h </w:instrText>
             </w:r>
             <w:r>
               <w:rPr>
@@ -2725,7 +2798,7 @@
               <w:rPr>
                 <w:noProof/>
               </w:rPr>
-              <w:t>22</w:t>
+              <w:t>23</w:t>
             </w:r>
             <w:r>
               <w:rPr>
@@ -2750,7 +2823,7 @@
               <w14:ligatures w14:val="standardContextual"/>
             </w:rPr>
           </w:pPr>
-          <w:hyperlink w:anchor="_Toc242127696" w:history="1">
+          <w:hyperlink w:anchor="_Toc242144195" w:history="1">
             <w:r>
               <w:rPr>
                 <w:rStyle w:val="Hyperlink"/>
@@ -2774,7 +2847,7 @@
               <w:rPr>
                 <w:noProof/>
               </w:rPr>
-              <w:instrText xml:space="preserve"> PAGEREF _Toc242127696 \h </w:instrText>
+              <w:instrText xml:space="preserve"> PAGEREF _Toc242144195 \h </w:instrText>
             </w:r>
             <w:r>
               <w:rPr>
@@ -2791,7 +2864,7 @@
               <w:rPr>
                 <w:noProof/>
               </w:rPr>
-              <w:t>22</w:t>
+              <w:t>23</w:t>
             </w:r>
             <w:r>
               <w:rPr>
@@ -2816,7 +2889,7 @@
               <w14:ligatures w14:val="standardContextual"/>
             </w:rPr>
           </w:pPr>
-          <w:hyperlink w:anchor="_Toc242127697" w:history="1">
+          <w:hyperlink w:anchor="_Toc242144196" w:history="1">
             <w:r>
               <w:rPr>
                 <w:rStyle w:val="Hyperlink"/>
@@ -2840,7 +2913,7 @@
               <w:rPr>
                 <w:noProof/>
               </w:rPr>
-              <w:instrText xml:space="preserve"> PAGEREF _Toc242127697 \h </w:instrText>
+              <w:instrText xml:space="preserve"> PAGEREF _Toc242144196 \h </w:instrText>
             </w:r>
             <w:r>
               <w:rPr>
@@ -2857,7 +2930,7 @@
               <w:rPr>
                 <w:noProof/>
               </w:rPr>
-              <w:t>22</w:t>
+              <w:t>23</w:t>
             </w:r>
             <w:r>
               <w:rPr>
@@ -2882,7 +2955,7 @@
               <w14:ligatures w14:val="standardContextual"/>
             </w:rPr>
           </w:pPr>
-          <w:hyperlink w:anchor="_Toc242127698" w:history="1">
+          <w:hyperlink w:anchor="_Toc242144197" w:history="1">
             <w:r>
               <w:rPr>
                 <w:rStyle w:val="Hyperlink"/>
@@ -2906,7 +2979,7 @@
               <w:rPr>
                 <w:noProof/>
               </w:rPr>
-              <w:instrText xml:space="preserve"> PAGEREF _Toc242127698 \h </w:instrText>
+              <w:instrText xml:space="preserve"> PAGEREF _Toc242144197 \h </w:instrText>
             </w:r>
             <w:r>
               <w:rPr>
@@ -2923,7 +2996,7 @@
               <w:rPr>
                 <w:noProof/>
               </w:rPr>
-              <w:t>23</w:t>
+              <w:t>24</w:t>
             </w:r>
             <w:r>
               <w:rPr>
@@ -2948,7 +3021,7 @@
               <w14:ligatures w14:val="standardContextual"/>
             </w:rPr>
           </w:pPr>
-          <w:hyperlink w:anchor="_Toc242127699" w:history="1">
+          <w:hyperlink w:anchor="_Toc242144198" w:history="1">
             <w:r>
               <w:rPr>
                 <w:rStyle w:val="Hyperlink"/>
@@ -2972,7 +3045,7 @@
               <w:rPr>
                 <w:noProof/>
               </w:rPr>
-              <w:instrText xml:space="preserve"> PAGEREF _Toc242127699 \h </w:instrText>
+              <w:instrText xml:space="preserve"> PAGEREF _Toc242144198 \h </w:instrText>
             </w:r>
             <w:r>
               <w:rPr>
@@ -2989,7 +3062,7 @@
               <w:rPr>
                 <w:noProof/>
               </w:rPr>
-              <w:t>24</w:t>
+              <w:t>25</w:t>
             </w:r>
             <w:r>
               <w:rPr>
@@ -3014,7 +3087,7 @@
               <w14:ligatures w14:val="standardContextual"/>
             </w:rPr>
           </w:pPr>
-          <w:hyperlink w:anchor="_Toc242127700" w:history="1">
+          <w:hyperlink w:anchor="_Toc242144199" w:history="1">
             <w:r>
               <w:rPr>
                 <w:rStyle w:val="Hyperlink"/>
@@ -3038,7 +3111,7 @@
               <w:rPr>
                 <w:noProof/>
               </w:rPr>
-              <w:instrText xml:space="preserve"> PAGEREF _Toc242127700 \h </w:instrText>
+              <w:instrText xml:space="preserve"> PAGEREF _Toc242144199 \h </w:instrText>
             </w:r>
             <w:r>
               <w:rPr>
@@ -3055,7 +3128,7 @@
               <w:rPr>
                 <w:noProof/>
               </w:rPr>
-              <w:t>24</w:t>
+              <w:t>25</w:t>
             </w:r>
             <w:r>
               <w:rPr>
@@ -3080,7 +3153,7 @@
               <w14:ligatures w14:val="standardContextual"/>
             </w:rPr>
           </w:pPr>
-          <w:hyperlink w:anchor="_Toc242127701" w:history="1">
+          <w:hyperlink w:anchor="_Toc242144200" w:history="1">
             <w:r>
               <w:rPr>
                 <w:rStyle w:val="Hyperlink"/>
@@ -3104,7 +3177,7 @@
               <w:rPr>
                 <w:noProof/>
               </w:rPr>
-              <w:instrText xml:space="preserve"> PAGEREF _Toc242127701 \h </w:instrText>
+              <w:instrText xml:space="preserve"> PAGEREF _Toc242144200 \h </w:instrText>
             </w:r>
             <w:r>
               <w:rPr>
@@ -3121,7 +3194,7 @@
               <w:rPr>
                 <w:noProof/>
               </w:rPr>
-              <w:t>24</w:t>
+              <w:t>25</w:t>
             </w:r>
             <w:r>
               <w:rPr>
@@ -3146,7 +3219,7 @@
               <w14:ligatures w14:val="standardContextual"/>
             </w:rPr>
           </w:pPr>
-          <w:hyperlink w:anchor="_Toc242127702" w:history="1">
+          <w:hyperlink w:anchor="_Toc242144201" w:history="1">
             <w:r>
               <w:rPr>
                 <w:rStyle w:val="Hyperlink"/>
@@ -3170,7 +3243,7 @@
               <w:rPr>
                 <w:noProof/>
               </w:rPr>
-              <w:instrText xml:space="preserve"> PAGEREF _Toc242127702 \h </w:instrText>
+              <w:instrText xml:space="preserve"> PAGEREF _Toc242144201 \h </w:instrText>
             </w:r>
             <w:r>
               <w:rPr>
@@ -3187,7 +3260,7 @@
               <w:rPr>
                 <w:noProof/>
               </w:rPr>
-              <w:t>25</w:t>
+              <w:t>26</w:t>
             </w:r>
             <w:r>
               <w:rPr>
@@ -3212,7 +3285,7 @@
               <w14:ligatures w14:val="standardContextual"/>
             </w:rPr>
           </w:pPr>
-          <w:hyperlink w:anchor="_Toc242127703" w:history="1">
+          <w:hyperlink w:anchor="_Toc242144202" w:history="1">
             <w:r>
               <w:rPr>
                 <w:rStyle w:val="Hyperlink"/>
@@ -3236,7 +3309,7 @@
               <w:rPr>
                 <w:noProof/>
               </w:rPr>
-              <w:instrText xml:space="preserve"> PAGEREF _Toc242127703 \h </w:instrText>
+              <w:instrText xml:space="preserve"> PAGEREF _Toc242144202 \h </w:instrText>
             </w:r>
             <w:r>
               <w:rPr>
@@ -3253,7 +3326,7 @@
               <w:rPr>
                 <w:noProof/>
               </w:rPr>
-              <w:t>25</w:t>
+              <w:t>26</w:t>
             </w:r>
             <w:r>
               <w:rPr>
@@ -3278,7 +3351,7 @@
               <w14:ligatures w14:val="standardContextual"/>
             </w:rPr>
           </w:pPr>
-          <w:hyperlink w:anchor="_Toc242127704" w:history="1">
+          <w:hyperlink w:anchor="_Toc242144203" w:history="1">
             <w:r>
               <w:rPr>
                 <w:rStyle w:val="Hyperlink"/>
@@ -3302,7 +3375,7 @@
               <w:rPr>
                 <w:noProof/>
               </w:rPr>
-              <w:instrText xml:space="preserve"> PAGEREF _Toc242127704 \h </w:instrText>
+              <w:instrText xml:space="preserve"> PAGEREF _Toc242144203 \h </w:instrText>
             </w:r>
             <w:r>
               <w:rPr>
@@ -3319,7 +3392,7 @@
               <w:rPr>
                 <w:noProof/>
               </w:rPr>
-              <w:t>25</w:t>
+              <w:t>26</w:t>
             </w:r>
             <w:r>
               <w:rPr>
@@ -3344,7 +3417,7 @@
               <w14:ligatures w14:val="standardContextual"/>
             </w:rPr>
           </w:pPr>
-          <w:hyperlink w:anchor="_Toc242127705" w:history="1">
+          <w:hyperlink w:anchor="_Toc242144204" w:history="1">
             <w:r>
               <w:rPr>
                 <w:rStyle w:val="Hyperlink"/>
@@ -3368,7 +3441,7 @@
               <w:rPr>
                 <w:noProof/>
               </w:rPr>
-              <w:instrText xml:space="preserve"> PAGEREF _Toc242127705 \h </w:instrText>
+              <w:instrText xml:space="preserve"> PAGEREF _Toc242144204 \h </w:instrText>
             </w:r>
             <w:r>
               <w:rPr>
@@ -3385,7 +3458,7 @@
               <w:rPr>
                 <w:noProof/>
               </w:rPr>
-              <w:t>25</w:t>
+              <w:t>26</w:t>
             </w:r>
             <w:r>
               <w:rPr>
@@ -3410,7 +3483,7 @@
               <w14:ligatures w14:val="standardContextual"/>
             </w:rPr>
           </w:pPr>
-          <w:hyperlink w:anchor="_Toc242127706" w:history="1">
+          <w:hyperlink w:anchor="_Toc242144205" w:history="1">
             <w:r>
               <w:rPr>
                 <w:rStyle w:val="Hyperlink"/>
@@ -3434,7 +3507,7 @@
               <w:rPr>
                 <w:noProof/>
               </w:rPr>
-              <w:instrText xml:space="preserve"> PAGEREF _Toc242127706 \h </w:instrText>
+              <w:instrText xml:space="preserve"> PAGEREF _Toc242144205 \h </w:instrText>
             </w:r>
             <w:r>
               <w:rPr>
@@ -3451,7 +3524,7 @@
               <w:rPr>
                 <w:noProof/>
               </w:rPr>
-              <w:t>25</w:t>
+              <w:t>26</w:t>
             </w:r>
             <w:r>
               <w:rPr>
@@ -3476,7 +3549,7 @@
               <w14:ligatures w14:val="standardContextual"/>
             </w:rPr>
           </w:pPr>
-          <w:hyperlink w:anchor="_Toc242127707" w:history="1">
+          <w:hyperlink w:anchor="_Toc242144206" w:history="1">
             <w:r>
               <w:rPr>
                 <w:rStyle w:val="Hyperlink"/>
@@ -3500,7 +3573,7 @@
               <w:rPr>
                 <w:noProof/>
               </w:rPr>
-              <w:instrText xml:space="preserve"> PAGEREF _Toc242127707 \h </w:instrText>
+              <w:instrText xml:space="preserve"> PAGEREF _Toc242144206 \h </w:instrText>
             </w:r>
             <w:r>
               <w:rPr>
@@ -3517,7 +3590,7 @@
               <w:rPr>
                 <w:noProof/>
               </w:rPr>
-              <w:t>26</w:t>
+              <w:t>27</w:t>
             </w:r>
             <w:r>
               <w:rPr>
@@ -3542,7 +3615,7 @@
               <w14:ligatures w14:val="standardContextual"/>
             </w:rPr>
           </w:pPr>
-          <w:hyperlink w:anchor="_Toc242127708" w:history="1">
+          <w:hyperlink w:anchor="_Toc242144207" w:history="1">
             <w:r>
               <w:rPr>
                 <w:rStyle w:val="Hyperlink"/>
@@ -3566,7 +3639,7 @@
               <w:rPr>
                 <w:noProof/>
               </w:rPr>
-              <w:instrText xml:space="preserve"> PAGEREF _Toc242127708 \h </w:instrText>
+              <w:instrText xml:space="preserve"> PAGEREF _Toc242144207 \h </w:instrText>
             </w:r>
             <w:r>
               <w:rPr>
@@ -3583,7 +3656,7 @@
               <w:rPr>
                 <w:noProof/>
               </w:rPr>
-              <w:t>27</w:t>
+              <w:t>28</w:t>
             </w:r>
             <w:r>
               <w:rPr>
@@ -3608,7 +3681,7 @@
               <w14:ligatures w14:val="standardContextual"/>
             </w:rPr>
           </w:pPr>
-          <w:hyperlink w:anchor="_Toc242127709" w:history="1">
+          <w:hyperlink w:anchor="_Toc242144208" w:history="1">
             <w:r>
               <w:rPr>
                 <w:rStyle w:val="Hyperlink"/>
@@ -3632,7 +3705,7 @@
               <w:rPr>
                 <w:noProof/>
               </w:rPr>
-              <w:instrText xml:space="preserve"> PAGEREF _Toc242127709 \h </w:instrText>
+              <w:instrText xml:space="preserve"> PAGEREF _Toc242144208 \h </w:instrText>
             </w:r>
             <w:r>
               <w:rPr>
@@ -3649,7 +3722,7 @@
               <w:rPr>
                 <w:noProof/>
               </w:rPr>
-              <w:t>28</w:t>
+              <w:t>29</w:t>
             </w:r>
             <w:r>
               <w:rPr>
@@ -3674,7 +3747,7 @@
               <w14:ligatures w14:val="standardContextual"/>
             </w:rPr>
           </w:pPr>
-          <w:hyperlink w:anchor="_Toc242127710" w:history="1">
+          <w:hyperlink w:anchor="_Toc242144209" w:history="1">
             <w:r>
               <w:rPr>
                 <w:rStyle w:val="Hyperlink"/>
@@ -3698,7 +3771,7 @@
               <w:rPr>
                 <w:noProof/>
               </w:rPr>
-              <w:instrText xml:space="preserve"> PAGEREF _Toc242127710 \h </w:instrText>
+              <w:instrText xml:space="preserve"> PAGEREF _Toc242144209 \h </w:instrText>
             </w:r>
             <w:r>
               <w:rPr>
@@ -3715,7 +3788,7 @@
               <w:rPr>
                 <w:noProof/>
               </w:rPr>
-              <w:t>29</w:t>
+              <w:t>30</w:t>
             </w:r>
             <w:r>
               <w:rPr>
@@ -3745,7 +3818,7 @@
         <w:pStyle w:val="Heading1"/>
         <w:pageBreakBefore/>
       </w:pPr>
-      <w:bookmarkStart w:id="1" w:name="_Toc242127657"/>
+      <w:bookmarkStart w:id="1" w:name="_Toc242144155"/>
       <w:r>
         <w:lastRenderedPageBreak/>
         <w:t>1. How to use this guide</w:t>
@@ -3873,7 +3946,7 @@
         <w:pStyle w:val="Heading1"/>
         <w:pageBreakBefore/>
       </w:pPr>
-      <w:bookmarkStart w:id="2" w:name="_Toc242127658"/>
+      <w:bookmarkStart w:id="2" w:name="_Toc242144156"/>
       <w:r>
         <w:lastRenderedPageBreak/>
         <w:t>2. The big picture</w:t>
@@ -3884,7 +3957,7 @@
       <w:pPr>
         <w:pStyle w:val="Heading2"/>
       </w:pPr>
-      <w:bookmarkStart w:id="3" w:name="_Toc242127659"/>
+      <w:bookmarkStart w:id="3" w:name="_Toc242144157"/>
       <w:r>
         <w:t>2.1 What NEST.PH is</w:t>
       </w:r>
@@ -3920,7 +3993,7 @@
       <w:pPr>
         <w:pStyle w:val="Heading2"/>
       </w:pPr>
-      <w:bookmarkStart w:id="4" w:name="_Toc242127660"/>
+      <w:bookmarkStart w:id="4" w:name="_Toc242144158"/>
       <w:r>
         <w:t>2.2 Who uses it</w:t>
       </w:r>
@@ -3949,12 +4022,6 @@
         <w:gridCol w:w="2000"/>
       </w:tblGrid>
       <w:tr>
-        <w:tblPrEx>
-          <w:tblCellMar>
-            <w:top w:w="0" w:type="dxa"/>
-            <w:bottom w:w="0" w:type="dxa"/>
-          </w:tblCellMar>
-        </w:tblPrEx>
         <w:trPr>
           <w:tblHeader/>
         </w:trPr>
@@ -4041,12 +4108,6 @@
         </w:tc>
       </w:tr>
       <w:tr>
-        <w:tblPrEx>
-          <w:tblCellMar>
-            <w:top w:w="0" w:type="dxa"/>
-            <w:bottom w:w="0" w:type="dxa"/>
-          </w:tblCellMar>
-        </w:tblPrEx>
         <w:tc>
           <w:tcPr>
             <w:tcW w:w="2200" w:type="dxa"/>
@@ -4115,12 +4176,6 @@
         </w:tc>
       </w:tr>
       <w:tr>
-        <w:tblPrEx>
-          <w:tblCellMar>
-            <w:top w:w="0" w:type="dxa"/>
-            <w:bottom w:w="0" w:type="dxa"/>
-          </w:tblCellMar>
-        </w:tblPrEx>
         <w:tc>
           <w:tcPr>
             <w:tcW w:w="2200" w:type="dxa"/>
@@ -4189,12 +4244,6 @@
         </w:tc>
       </w:tr>
       <w:tr>
-        <w:tblPrEx>
-          <w:tblCellMar>
-            <w:top w:w="0" w:type="dxa"/>
-            <w:bottom w:w="0" w:type="dxa"/>
-          </w:tblCellMar>
-        </w:tblPrEx>
         <w:tc>
           <w:tcPr>
             <w:tcW w:w="2200" w:type="dxa"/>
@@ -4272,7 +4321,7 @@
       <w:pPr>
         <w:pStyle w:val="Heading2"/>
       </w:pPr>
-      <w:bookmarkStart w:id="5" w:name="_Toc242127661"/>
+      <w:bookmarkStart w:id="5" w:name="_Toc242144159"/>
       <w:r>
         <w:t>2.3 The tools we built it with</w:t>
       </w:r>
@@ -4301,12 +4350,6 @@
         <w:gridCol w:w="3460"/>
       </w:tblGrid>
       <w:tr>
-        <w:tblPrEx>
-          <w:tblCellMar>
-            <w:top w:w="0" w:type="dxa"/>
-            <w:bottom w:w="0" w:type="dxa"/>
-          </w:tblCellMar>
-        </w:tblPrEx>
         <w:trPr>
           <w:tblHeader/>
         </w:trPr>
@@ -4393,12 +4436,6 @@
         </w:tc>
       </w:tr>
       <w:tr>
-        <w:tblPrEx>
-          <w:tblCellMar>
-            <w:top w:w="0" w:type="dxa"/>
-            <w:bottom w:w="0" w:type="dxa"/>
-          </w:tblCellMar>
-        </w:tblPrEx>
         <w:tc>
           <w:tcPr>
             <w:tcW w:w="2200" w:type="dxa"/>
@@ -4467,12 +4504,6 @@
         </w:tc>
       </w:tr>
       <w:tr>
-        <w:tblPrEx>
-          <w:tblCellMar>
-            <w:top w:w="0" w:type="dxa"/>
-            <w:bottom w:w="0" w:type="dxa"/>
-          </w:tblCellMar>
-        </w:tblPrEx>
         <w:tc>
           <w:tcPr>
             <w:tcW w:w="2200" w:type="dxa"/>
@@ -4541,12 +4572,6 @@
         </w:tc>
       </w:tr>
       <w:tr>
-        <w:tblPrEx>
-          <w:tblCellMar>
-            <w:top w:w="0" w:type="dxa"/>
-            <w:bottom w:w="0" w:type="dxa"/>
-          </w:tblCellMar>
-        </w:tblPrEx>
         <w:tc>
           <w:tcPr>
             <w:tcW w:w="2200" w:type="dxa"/>
@@ -4615,12 +4640,6 @@
         </w:tc>
       </w:tr>
       <w:tr>
-        <w:tblPrEx>
-          <w:tblCellMar>
-            <w:top w:w="0" w:type="dxa"/>
-            <w:bottom w:w="0" w:type="dxa"/>
-          </w:tblCellMar>
-        </w:tblPrEx>
         <w:tc>
           <w:tcPr>
             <w:tcW w:w="2200" w:type="dxa"/>
@@ -4689,12 +4708,6 @@
         </w:tc>
       </w:tr>
       <w:tr>
-        <w:tblPrEx>
-          <w:tblCellMar>
-            <w:top w:w="0" w:type="dxa"/>
-            <w:bottom w:w="0" w:type="dxa"/>
-          </w:tblCellMar>
-        </w:tblPrEx>
         <w:tc>
           <w:tcPr>
             <w:tcW w:w="2200" w:type="dxa"/>
@@ -4763,12 +4776,6 @@
         </w:tc>
       </w:tr>
       <w:tr>
-        <w:tblPrEx>
-          <w:tblCellMar>
-            <w:top w:w="0" w:type="dxa"/>
-            <w:bottom w:w="0" w:type="dxa"/>
-          </w:tblCellMar>
-        </w:tblPrEx>
         <w:tc>
           <w:tcPr>
             <w:tcW w:w="2200" w:type="dxa"/>
@@ -4837,12 +4844,6 @@
         </w:tc>
       </w:tr>
       <w:tr>
-        <w:tblPrEx>
-          <w:tblCellMar>
-            <w:top w:w="0" w:type="dxa"/>
-            <w:bottom w:w="0" w:type="dxa"/>
-          </w:tblCellMar>
-        </w:tblPrEx>
         <w:tc>
           <w:tcPr>
             <w:tcW w:w="2200" w:type="dxa"/>
@@ -4912,12 +4913,6 @@
         </w:tc>
       </w:tr>
       <w:tr>
-        <w:tblPrEx>
-          <w:tblCellMar>
-            <w:top w:w="0" w:type="dxa"/>
-            <w:bottom w:w="0" w:type="dxa"/>
-          </w:tblCellMar>
-        </w:tblPrEx>
         <w:tc>
           <w:tcPr>
             <w:tcW w:w="2200" w:type="dxa"/>
@@ -4986,12 +4981,6 @@
         </w:tc>
       </w:tr>
       <w:tr>
-        <w:tblPrEx>
-          <w:tblCellMar>
-            <w:top w:w="0" w:type="dxa"/>
-            <w:bottom w:w="0" w:type="dxa"/>
-          </w:tblCellMar>
-        </w:tblPrEx>
         <w:tc>
           <w:tcPr>
             <w:tcW w:w="2200" w:type="dxa"/>
@@ -5069,7 +5058,7 @@
       <w:pPr>
         <w:pStyle w:val="Heading2"/>
       </w:pPr>
-      <w:bookmarkStart w:id="6" w:name="_Toc242127662"/>
+      <w:bookmarkStart w:id="6" w:name="_Toc242144160"/>
       <w:r>
         <w:t>2.4 Five words you will hear a lot</w:t>
       </w:r>
@@ -5096,12 +5085,6 @@
         <w:gridCol w:w="9360"/>
       </w:tblGrid>
       <w:tr>
-        <w:tblPrEx>
-          <w:tblCellMar>
-            <w:top w:w="0" w:type="dxa"/>
-            <w:bottom w:w="0" w:type="dxa"/>
-          </w:tblCellMar>
-        </w:tblPrEx>
         <w:tc>
           <w:tcPr>
             <w:tcW w:w="9360" w:type="dxa"/>
@@ -5207,12 +5190,6 @@
         <w:gridCol w:w="4360"/>
       </w:tblGrid>
       <w:tr>
-        <w:tblPrEx>
-          <w:tblCellMar>
-            <w:top w:w="0" w:type="dxa"/>
-            <w:bottom w:w="0" w:type="dxa"/>
-          </w:tblCellMar>
-        </w:tblPrEx>
         <w:trPr>
           <w:tblHeader/>
         </w:trPr>
@@ -5299,12 +5276,6 @@
         </w:tc>
       </w:tr>
       <w:tr>
-        <w:tblPrEx>
-          <w:tblCellMar>
-            <w:top w:w="0" w:type="dxa"/>
-            <w:bottom w:w="0" w:type="dxa"/>
-          </w:tblCellMar>
-        </w:tblPrEx>
         <w:tc>
           <w:tcPr>
             <w:tcW w:w="1700" w:type="dxa"/>
@@ -5373,12 +5344,6 @@
         </w:tc>
       </w:tr>
       <w:tr>
-        <w:tblPrEx>
-          <w:tblCellMar>
-            <w:top w:w="0" w:type="dxa"/>
-            <w:bottom w:w="0" w:type="dxa"/>
-          </w:tblCellMar>
-        </w:tblPrEx>
         <w:tc>
           <w:tcPr>
             <w:tcW w:w="1700" w:type="dxa"/>
@@ -5447,12 +5412,6 @@
         </w:tc>
       </w:tr>
       <w:tr>
-        <w:tblPrEx>
-          <w:tblCellMar>
-            <w:top w:w="0" w:type="dxa"/>
-            <w:bottom w:w="0" w:type="dxa"/>
-          </w:tblCellMar>
-        </w:tblPrEx>
         <w:tc>
           <w:tcPr>
             <w:tcW w:w="1700" w:type="dxa"/>
@@ -5521,12 +5480,6 @@
         </w:tc>
       </w:tr>
       <w:tr>
-        <w:tblPrEx>
-          <w:tblCellMar>
-            <w:top w:w="0" w:type="dxa"/>
-            <w:bottom w:w="0" w:type="dxa"/>
-          </w:tblCellMar>
-        </w:tblPrEx>
         <w:tc>
           <w:tcPr>
             <w:tcW w:w="1700" w:type="dxa"/>
@@ -5595,12 +5548,6 @@
         </w:tc>
       </w:tr>
       <w:tr>
-        <w:tblPrEx>
-          <w:tblCellMar>
-            <w:top w:w="0" w:type="dxa"/>
-            <w:bottom w:w="0" w:type="dxa"/>
-          </w:tblCellMar>
-        </w:tblPrEx>
         <w:tc>
           <w:tcPr>
             <w:tcW w:w="1700" w:type="dxa"/>
@@ -5669,12 +5616,6 @@
         </w:tc>
       </w:tr>
       <w:tr>
-        <w:tblPrEx>
-          <w:tblCellMar>
-            <w:top w:w="0" w:type="dxa"/>
-            <w:bottom w:w="0" w:type="dxa"/>
-          </w:tblCellMar>
-        </w:tblPrEx>
         <w:tc>
           <w:tcPr>
             <w:tcW w:w="1700" w:type="dxa"/>
@@ -5743,12 +5684,6 @@
         </w:tc>
       </w:tr>
       <w:tr>
-        <w:tblPrEx>
-          <w:tblCellMar>
-            <w:top w:w="0" w:type="dxa"/>
-            <w:bottom w:w="0" w:type="dxa"/>
-          </w:tblCellMar>
-        </w:tblPrEx>
         <w:tc>
           <w:tcPr>
             <w:tcW w:w="1700" w:type="dxa"/>
@@ -5826,7 +5761,7 @@
       <w:pPr>
         <w:pStyle w:val="Heading2"/>
       </w:pPr>
-      <w:bookmarkStart w:id="7" w:name="_Toc242127663"/>
+      <w:bookmarkStart w:id="7" w:name="_Toc242144161"/>
       <w:r>
         <w:t>2.5 Where things live in the project</w:t>
       </w:r>
@@ -5854,12 +5789,6 @@
         <w:gridCol w:w="6560"/>
       </w:tblGrid>
       <w:tr>
-        <w:tblPrEx>
-          <w:tblCellMar>
-            <w:top w:w="0" w:type="dxa"/>
-            <w:bottom w:w="0" w:type="dxa"/>
-          </w:tblCellMar>
-        </w:tblPrEx>
         <w:trPr>
           <w:tblHeader/>
         </w:trPr>
@@ -5919,12 +5848,6 @@
         </w:tc>
       </w:tr>
       <w:tr>
-        <w:tblPrEx>
-          <w:tblCellMar>
-            <w:top w:w="0" w:type="dxa"/>
-            <w:bottom w:w="0" w:type="dxa"/>
-          </w:tblCellMar>
-        </w:tblPrEx>
         <w:tc>
           <w:tcPr>
             <w:tcW w:w="2800" w:type="dxa"/>
@@ -5971,12 +5894,6 @@
         </w:tc>
       </w:tr>
       <w:tr>
-        <w:tblPrEx>
-          <w:tblCellMar>
-            <w:top w:w="0" w:type="dxa"/>
-            <w:bottom w:w="0" w:type="dxa"/>
-          </w:tblCellMar>
-        </w:tblPrEx>
         <w:tc>
           <w:tcPr>
             <w:tcW w:w="2800" w:type="dxa"/>
@@ -6023,12 +5940,6 @@
         </w:tc>
       </w:tr>
       <w:tr>
-        <w:tblPrEx>
-          <w:tblCellMar>
-            <w:top w:w="0" w:type="dxa"/>
-            <w:bottom w:w="0" w:type="dxa"/>
-          </w:tblCellMar>
-        </w:tblPrEx>
         <w:tc>
           <w:tcPr>
             <w:tcW w:w="2800" w:type="dxa"/>
@@ -6047,7 +5958,6 @@
           </w:tcPr>
           <w:p>
             <w:r>
-              <w:lastRenderedPageBreak/>
               <w:t>app/Http/Controllers</w:t>
             </w:r>
           </w:p>
@@ -6076,12 +5986,6 @@
         </w:tc>
       </w:tr>
       <w:tr>
-        <w:tblPrEx>
-          <w:tblCellMar>
-            <w:top w:w="0" w:type="dxa"/>
-            <w:bottom w:w="0" w:type="dxa"/>
-          </w:tblCellMar>
-        </w:tblPrEx>
         <w:tc>
           <w:tcPr>
             <w:tcW w:w="2800" w:type="dxa"/>
@@ -6128,12 +6032,6 @@
         </w:tc>
       </w:tr>
       <w:tr>
-        <w:tblPrEx>
-          <w:tblCellMar>
-            <w:top w:w="0" w:type="dxa"/>
-            <w:bottom w:w="0" w:type="dxa"/>
-          </w:tblCellMar>
-        </w:tblPrEx>
         <w:tc>
           <w:tcPr>
             <w:tcW w:w="2800" w:type="dxa"/>
@@ -6180,12 +6078,6 @@
         </w:tc>
       </w:tr>
       <w:tr>
-        <w:tblPrEx>
-          <w:tblCellMar>
-            <w:top w:w="0" w:type="dxa"/>
-            <w:bottom w:w="0" w:type="dxa"/>
-          </w:tblCellMar>
-        </w:tblPrEx>
         <w:tc>
           <w:tcPr>
             <w:tcW w:w="2800" w:type="dxa"/>
@@ -6232,12 +6124,6 @@
         </w:tc>
       </w:tr>
       <w:tr>
-        <w:tblPrEx>
-          <w:tblCellMar>
-            <w:top w:w="0" w:type="dxa"/>
-            <w:bottom w:w="0" w:type="dxa"/>
-          </w:tblCellMar>
-        </w:tblPrEx>
         <w:tc>
           <w:tcPr>
             <w:tcW w:w="2800" w:type="dxa"/>
@@ -6284,12 +6170,6 @@
         </w:tc>
       </w:tr>
       <w:tr>
-        <w:tblPrEx>
-          <w:tblCellMar>
-            <w:top w:w="0" w:type="dxa"/>
-            <w:bottom w:w="0" w:type="dxa"/>
-          </w:tblCellMar>
-        </w:tblPrEx>
         <w:tc>
           <w:tcPr>
             <w:tcW w:w="2800" w:type="dxa"/>
@@ -6336,12 +6216,6 @@
         </w:tc>
       </w:tr>
       <w:tr>
-        <w:tblPrEx>
-          <w:tblCellMar>
-            <w:top w:w="0" w:type="dxa"/>
-            <w:bottom w:w="0" w:type="dxa"/>
-          </w:tblCellMar>
-        </w:tblPrEx>
         <w:tc>
           <w:tcPr>
             <w:tcW w:w="2800" w:type="dxa"/>
@@ -6388,12 +6262,6 @@
         </w:tc>
       </w:tr>
       <w:tr>
-        <w:tblPrEx>
-          <w:tblCellMar>
-            <w:top w:w="0" w:type="dxa"/>
-            <w:bottom w:w="0" w:type="dxa"/>
-          </w:tblCellMar>
-        </w:tblPrEx>
         <w:tc>
           <w:tcPr>
             <w:tcW w:w="2800" w:type="dxa"/>
@@ -6450,9 +6318,8 @@
         <w:pStyle w:val="Heading1"/>
         <w:pageBreakBefore/>
       </w:pPr>
-      <w:bookmarkStart w:id="8" w:name="_Toc242127664"/>
-      <w:r>
-        <w:lastRenderedPageBreak/>
+      <w:bookmarkStart w:id="8" w:name="_Toc242144162"/>
+      <w:r>
         <w:t>3. The whole journey in one page</w:t>
       </w:r>
       <w:bookmarkEnd w:id="8"/>
@@ -6640,9 +6507,8 @@
         <w:pStyle w:val="Heading1"/>
         <w:pageBreakBefore/>
       </w:pPr>
-      <w:bookmarkStart w:id="9" w:name="_Toc242127665"/>
-      <w:r>
-        <w:lastRenderedPageBreak/>
+      <w:bookmarkStart w:id="9" w:name="_Toc242144163"/>
+      <w:r>
         <w:t>4. Logging in and account security</w:t>
       </w:r>
       <w:bookmarkEnd w:id="9"/>
@@ -6651,7 +6517,7 @@
       <w:pPr>
         <w:pStyle w:val="Heading2"/>
       </w:pPr>
-      <w:bookmarkStart w:id="10" w:name="_Toc242127666"/>
+      <w:bookmarkStart w:id="10" w:name="_Toc242144164"/>
       <w:r>
         <w:t>What it does</w:t>
       </w:r>
@@ -6669,7 +6535,7 @@
       <w:pPr>
         <w:pStyle w:val="Heading2"/>
       </w:pPr>
-      <w:bookmarkStart w:id="11" w:name="_Toc242127667"/>
+      <w:bookmarkStart w:id="11" w:name="_Toc242144165"/>
       <w:r>
         <w:t>How it works</w:t>
       </w:r>
@@ -6814,12 +6680,6 @@
         <w:gridCol w:w="9360"/>
       </w:tblGrid>
       <w:tr>
-        <w:tblPrEx>
-          <w:tblCellMar>
-            <w:top w:w="0" w:type="dxa"/>
-            <w:bottom w:w="0" w:type="dxa"/>
-          </w:tblCellMar>
-        </w:tblPrEx>
         <w:tc>
           <w:tcPr>
             <w:tcW w:w="9360" w:type="dxa"/>
@@ -7076,7 +6936,6 @@
           <w:bCs/>
           <w:color w:val="197335"/>
         </w:rPr>
-        <w:lastRenderedPageBreak/>
         <w:t xml:space="preserve">Where the code is: </w:t>
       </w:r>
       <w:r>
@@ -7245,9 +7104,8 @@
         <w:pStyle w:val="Heading1"/>
         <w:pageBreakBefore/>
       </w:pPr>
-      <w:bookmarkStart w:id="12" w:name="_Toc242127668"/>
-      <w:r>
-        <w:lastRenderedPageBreak/>
+      <w:bookmarkStart w:id="12" w:name="_Toc242144166"/>
+      <w:r>
         <w:t>5. Rooms, beds and VR tours</w:t>
       </w:r>
       <w:bookmarkEnd w:id="12"/>
@@ -7256,7 +7114,7 @@
       <w:pPr>
         <w:pStyle w:val="Heading2"/>
       </w:pPr>
-      <w:bookmarkStart w:id="13" w:name="_Toc242127669"/>
+      <w:bookmarkStart w:id="13" w:name="_Toc242144167"/>
       <w:r>
         <w:t>What it does</w:t>
       </w:r>
@@ -7284,7 +7142,7 @@
       <w:pPr>
         <w:pStyle w:val="Heading2"/>
       </w:pPr>
-      <w:bookmarkStart w:id="14" w:name="_Toc242127670"/>
+      <w:bookmarkStart w:id="14" w:name="_Toc242144168"/>
       <w:r>
         <w:t>How it works</w:t>
       </w:r>
@@ -7517,9 +7375,8 @@
         <w:pStyle w:val="Heading1"/>
         <w:pageBreakBefore/>
       </w:pPr>
-      <w:bookmarkStart w:id="15" w:name="_Toc242127671"/>
-      <w:r>
-        <w:lastRenderedPageBreak/>
+      <w:bookmarkStart w:id="15" w:name="_Toc242144169"/>
+      <w:r>
         <w:t>6. Applying and signing the documents online</w:t>
       </w:r>
       <w:bookmarkEnd w:id="15"/>
@@ -7528,7 +7385,7 @@
       <w:pPr>
         <w:pStyle w:val="Heading2"/>
       </w:pPr>
-      <w:bookmarkStart w:id="16" w:name="_Toc242127672"/>
+      <w:bookmarkStart w:id="16" w:name="_Toc242144170"/>
       <w:r>
         <w:t>What it does</w:t>
       </w:r>
@@ -7546,7 +7403,7 @@
       <w:pPr>
         <w:pStyle w:val="Heading2"/>
       </w:pPr>
-      <w:bookmarkStart w:id="17" w:name="_Toc242127673"/>
+      <w:bookmarkStart w:id="17" w:name="_Toc242144171"/>
       <w:r>
         <w:t>How it works</w:t>
       </w:r>
@@ -7701,12 +7558,6 @@
         <w:gridCol w:w="9360"/>
       </w:tblGrid>
       <w:tr>
-        <w:tblPrEx>
-          <w:tblCellMar>
-            <w:top w:w="0" w:type="dxa"/>
-            <w:bottom w:w="0" w:type="dxa"/>
-          </w:tblCellMar>
-        </w:tblPrEx>
         <w:tc>
           <w:tcPr>
             <w:tcW w:w="9360" w:type="dxa"/>
@@ -7917,9 +7768,8 @@
         <w:pStyle w:val="Heading1"/>
         <w:pageBreakBefore/>
       </w:pPr>
-      <w:bookmarkStart w:id="18" w:name="_Toc242127674"/>
-      <w:r>
-        <w:lastRenderedPageBreak/>
+      <w:bookmarkStart w:id="18" w:name="_Toc242144172"/>
+      <w:r>
         <w:t>7. Approving an application</w:t>
       </w:r>
       <w:bookmarkEnd w:id="18"/>
@@ -7928,7 +7778,7 @@
       <w:pPr>
         <w:pStyle w:val="Heading2"/>
       </w:pPr>
-      <w:bookmarkStart w:id="19" w:name="_Toc242127675"/>
+      <w:bookmarkStart w:id="19" w:name="_Toc242144173"/>
       <w:r>
         <w:t>What it does</w:t>
       </w:r>
@@ -7946,7 +7796,7 @@
       <w:pPr>
         <w:pStyle w:val="Heading2"/>
       </w:pPr>
-      <w:bookmarkStart w:id="20" w:name="_Toc242127676"/>
+      <w:bookmarkStart w:id="20" w:name="_Toc242144174"/>
       <w:r>
         <w:t>How it works (approve)</w:t>
       </w:r>
@@ -8205,12 +8055,6 @@
         <w:gridCol w:w="9360"/>
       </w:tblGrid>
       <w:tr>
-        <w:tblPrEx>
-          <w:tblCellMar>
-            <w:top w:w="0" w:type="dxa"/>
-            <w:bottom w:w="0" w:type="dxa"/>
-          </w:tblCellMar>
-        </w:tblPrEx>
         <w:tc>
           <w:tcPr>
             <w:tcW w:w="9360" w:type="dxa"/>
@@ -8415,9 +8259,8 @@
         <w:pStyle w:val="Heading1"/>
         <w:pageBreakBefore/>
       </w:pPr>
-      <w:bookmarkStart w:id="21" w:name="_Toc242127677"/>
-      <w:r>
-        <w:lastRenderedPageBreak/>
+      <w:bookmarkStart w:id="21" w:name="_Toc242144175"/>
+      <w:r>
         <w:t>8. Move-in payment</w:t>
       </w:r>
       <w:bookmarkEnd w:id="21"/>
@@ -8426,7 +8269,7 @@
       <w:pPr>
         <w:pStyle w:val="Heading2"/>
       </w:pPr>
-      <w:bookmarkStart w:id="22" w:name="_Toc242127678"/>
+      <w:bookmarkStart w:id="22" w:name="_Toc242144176"/>
       <w:r>
         <w:t>What it does</w:t>
       </w:r>
@@ -8444,7 +8287,7 @@
       <w:pPr>
         <w:pStyle w:val="Heading2"/>
       </w:pPr>
-      <w:bookmarkStart w:id="23" w:name="_Toc242127679"/>
+      <w:bookmarkStart w:id="23" w:name="_Toc242144177"/>
       <w:r>
         <w:t>How it works</w:t>
       </w:r>
@@ -8611,9 +8454,8 @@
         <w:pStyle w:val="Heading1"/>
         <w:pageBreakBefore/>
       </w:pPr>
-      <w:bookmarkStart w:id="24" w:name="_Toc242127680"/>
-      <w:r>
-        <w:lastRenderedPageBreak/>
+      <w:bookmarkStart w:id="24" w:name="_Toc242144178"/>
+      <w:r>
         <w:t>9. Monthly billing</w:t>
       </w:r>
       <w:bookmarkEnd w:id="24"/>
@@ -8622,7 +8464,7 @@
       <w:pPr>
         <w:pStyle w:val="Heading2"/>
       </w:pPr>
-      <w:bookmarkStart w:id="25" w:name="_Toc242127681"/>
+      <w:bookmarkStart w:id="25" w:name="_Toc242144179"/>
       <w:r>
         <w:t>What it does</w:t>
       </w:r>
@@ -8650,7 +8492,7 @@
       <w:pPr>
         <w:pStyle w:val="Heading2"/>
       </w:pPr>
-      <w:bookmarkStart w:id="26" w:name="_Toc242127682"/>
+      <w:bookmarkStart w:id="26" w:name="_Toc242144180"/>
       <w:r>
         <w:t>How it works</w:t>
       </w:r>
@@ -8745,7 +8587,7 @@
         <w:spacing w:after="60"/>
       </w:pPr>
       <w:r>
-        <w:t>Bill period = the calendar month (cut short if the contract ends mid-month, charged by the day).</w:t>
+        <w:t>Bill period = the calendar month, cut short if the contract ends mid-month. Mid-month move-in and move-out follow the proration settings (see "Proration" below).</w:t>
       </w:r>
     </w:p>
     <w:p>
@@ -8854,12 +8696,6 @@
         <w:gridCol w:w="9360"/>
       </w:tblGrid>
       <w:tr>
-        <w:tblPrEx>
-          <w:tblCellMar>
-            <w:top w:w="0" w:type="dxa"/>
-            <w:bottom w:w="0" w:type="dxa"/>
-          </w:tblCellMar>
-        </w:tblPrEx>
         <w:tc>
           <w:tcPr>
             <w:tcW w:w="9360" w:type="dxa"/>
@@ -8930,12 +8766,6 @@
         <w:gridCol w:w="9360"/>
       </w:tblGrid>
       <w:tr>
-        <w:tblPrEx>
-          <w:tblCellMar>
-            <w:top w:w="0" w:type="dxa"/>
-            <w:bottom w:w="0" w:type="dxa"/>
-          </w:tblCellMar>
-        </w:tblPrEx>
         <w:tc>
           <w:tcPr>
             <w:tcW w:w="9360" w:type="dxa"/>
@@ -8970,6 +8800,302 @@
     </w:p>
     <w:p>
       <w:pPr>
+        <w:pStyle w:val="Heading2"/>
+      </w:pPr>
+      <w:bookmarkStart w:id="27" w:name="_Toc242144181"/>
+      <w:r>
+        <w:t>Proration: mid-month move-in and move-out</w:t>
+      </w:r>
+      <w:bookmarkEnd w:id="27"/>
+    </w:p>
+    <w:p>
+      <w:pPr>
+        <w:spacing w:after="120"/>
+      </w:pPr>
+      <w:r>
+        <w:t>"Prorating" means charging only for the days a tenant actually stays. The daily price is always the monthly rate divided by the number of days in that month (28, 29, 30 or 31), and amounts are rounded to 2 decimals.</w:t>
+      </w:r>
+    </w:p>
+    <w:p>
+      <w:pPr>
+        <w:spacing w:after="120"/>
+      </w:pPr>
+      <w:r>
+        <w:rPr>
+          <w:b/>
+          <w:bCs/>
+        </w:rPr>
+        <w:t xml:space="preserve">Settings. </w:t>
+      </w:r>
+      <w:r>
+        <w:t>All of this is controlled by three settings in Dormitory Profile (policies section), so nothing is hard-coded:</w:t>
+      </w:r>
+    </w:p>
+    <w:p>
+      <w:pPr>
+        <w:spacing w:after="120"/>
+      </w:pPr>
+      <w:r>
+        <w:rPr>
+          <w:b/>
+          <w:bCs/>
+        </w:rPr>
+        <w:t xml:space="preserve">Rent due basis: </w:t>
+      </w:r>
+      <w:r>
+        <w:t>fixed day of the month (Pureza: the 1st, bills cover calendar months) or the tenant's start date (start Oct 16 → due Nov 16, Dec 16...).</w:t>
+      </w:r>
+    </w:p>
+    <w:p>
+      <w:pPr>
+        <w:spacing w:after="120"/>
+      </w:pPr>
+      <w:r>
+        <w:rPr>
+          <w:b/>
+          <w:bCs/>
+        </w:rPr>
+        <w:t xml:space="preserve">Mid-month move-in: </w:t>
+      </w:r>
+      <w:r>
+        <w:t>"Charged in full" (default, matches Pureza) or "Prorated (unused days credited on the first bill)".</w:t>
+      </w:r>
+    </w:p>
+    <w:p>
+      <w:pPr>
+        <w:spacing w:after="120"/>
+      </w:pPr>
+      <w:r>
+        <w:rPr>
+          <w:b/>
+          <w:bCs/>
+        </w:rPr>
+        <w:t xml:space="preserve">Mid-month move-out: </w:t>
+      </w:r>
+      <w:r>
+        <w:t>"Prorated (only the days stayed are charged)" (default) or "Charged in full".</w:t>
+      </w:r>
+    </w:p>
+    <w:p>
+      <w:pPr>
+        <w:pStyle w:val="Heading3"/>
+      </w:pPr>
+      <w:r>
+        <w:t>Move-in in the middle of a month (calendar-month dorms)</w:t>
+      </w:r>
+    </w:p>
+    <w:p>
+      <w:pPr>
+        <w:spacing w:after="120"/>
+      </w:pPr>
+      <w:r>
+        <w:t>The 1-month advance paid with the move-in fee covers the whole move-in month, so the first monthly bill is for the NEXT month. Example: monthly rate ₱3,000, moves in Oct 16.</w:t>
+      </w:r>
+    </w:p>
+    <w:p>
+      <w:pPr>
+        <w:spacing w:after="120"/>
+      </w:pPr>
+      <w:r>
+        <w:rPr>
+          <w:b/>
+          <w:bCs/>
+        </w:rPr>
+        <w:t xml:space="preserve">Charged in full (default): </w:t>
+      </w:r>
+      <w:r>
+        <w:t>the tenant keeps the rest of October "for free" as part of the advance. November bill rent = ₱3,000.</w:t>
+      </w:r>
+    </w:p>
+    <w:p>
+      <w:pPr>
+        <w:spacing w:after="120"/>
+      </w:pPr>
+      <w:r>
+        <w:rPr>
+          <w:b/>
+          <w:bCs/>
+        </w:rPr>
+        <w:t xml:space="preserve">Prorated: </w:t>
+      </w:r>
+      <w:r>
+        <w:t>the unused days of the advance (Oct 1–15) are given back as a credit on the first bill.</w:t>
+      </w:r>
+    </w:p>
+    <w:p>
+      <w:pPr>
+        <w:spacing w:after="60"/>
+        <w:ind w:left="360"/>
+      </w:pPr>
+      <w:r>
+        <w:rPr>
+          <w:rFonts w:ascii="Consolas" w:eastAsia="Consolas" w:hAnsi="Consolas" w:cs="Consolas"/>
+          <w:sz w:val="19"/>
+          <w:szCs w:val="19"/>
+        </w:rPr>
+        <w:t>unused days = 16 − 1 = 15;  credit = 3,000 × 15 ÷ 31 = 1,451.61</w:t>
+      </w:r>
+    </w:p>
+    <w:p>
+      <w:pPr>
+        <w:spacing w:after="60"/>
+        <w:ind w:left="360"/>
+      </w:pPr>
+      <w:r>
+        <w:rPr>
+          <w:rFonts w:ascii="Consolas" w:eastAsia="Consolas" w:hAnsi="Consolas" w:cs="Consolas"/>
+          <w:sz w:val="19"/>
+          <w:szCs w:val="19"/>
+        </w:rPr>
+        <w:t>November rent = 3,000 − 1,451.61 = 1,548.39</w:t>
+      </w:r>
+    </w:p>
+    <w:p>
+      <w:pPr>
+        <w:spacing w:after="120"/>
+      </w:pPr>
+      <w:r>
+        <w:t>The credit can never push rent below ₱0. A tenant who moves in on the 1st gets no credit.</w:t>
+      </w:r>
+    </w:p>
+    <w:p>
+      <w:pPr>
+        <w:spacing w:after="120"/>
+      </w:pPr>
+      <w:r>
+        <w:rPr>
+          <w:b/>
+          <w:bCs/>
+        </w:rPr>
+        <w:t xml:space="preserve">Walk-in contracts (no move-in fee): </w:t>
+      </w:r>
+      <w:r>
+        <w:t>a contract with no move-in bill is billed from its start date to the end of that month. That first short bill is charged in full, unless move-in proration is on; then it is charged by the day.</w:t>
+      </w:r>
+    </w:p>
+    <w:p>
+      <w:pPr>
+        <w:pStyle w:val="Heading3"/>
+      </w:pPr>
+      <w:r>
+        <w:t>Move-out in the middle of a month</w:t>
+      </w:r>
+    </w:p>
+    <w:p>
+      <w:pPr>
+        <w:spacing w:after="120"/>
+      </w:pPr>
+      <w:r>
+        <w:t>If the contract end date falls before the last day of the month, the last bill period stops on the end date. Example: ₱3,000 rate, contract ends Dec 10.</w:t>
+      </w:r>
+    </w:p>
+    <w:p>
+      <w:pPr>
+        <w:spacing w:after="60"/>
+        <w:ind w:left="360"/>
+      </w:pPr>
+      <w:r>
+        <w:rPr>
+          <w:rFonts w:ascii="Consolas" w:eastAsia="Consolas" w:hAnsi="Consolas" w:cs="Consolas"/>
+          <w:sz w:val="19"/>
+          <w:szCs w:val="19"/>
+        </w:rPr>
+        <w:t>Prorated (default): 3,000 × 10 ÷ 31 = 967.74</w:t>
+      </w:r>
+    </w:p>
+    <w:p>
+      <w:pPr>
+        <w:spacing w:after="60"/>
+        <w:ind w:left="360"/>
+      </w:pPr>
+      <w:r>
+        <w:rPr>
+          <w:rFonts w:ascii="Consolas" w:eastAsia="Consolas" w:hAnsi="Consolas" w:cs="Consolas"/>
+          <w:sz w:val="19"/>
+          <w:szCs w:val="19"/>
+        </w:rPr>
+        <w:t>Charged in full:    3,000</w:t>
+      </w:r>
+    </w:p>
+    <w:p>
+      <w:pPr>
+        <w:pStyle w:val="Heading3"/>
+      </w:pPr>
+      <w:r>
+        <w:t>Start-date billing</w:t>
+      </w:r>
+    </w:p>
+    <w:p>
+      <w:pPr>
+        <w:spacing w:after="120"/>
+      </w:pPr>
+      <w:r>
+        <w:t>When rent is due on the tenant's start day, every period runs start day to start day (Oct 16 – Nov 15), so a mid-month move-in never needs proration. Only a period cut short by the contract end date is prorated, using the number of days in that period, and the move-out setting still decides prorated vs full.</w:t>
+      </w:r>
+    </w:p>
+    <w:p>
+      <w:pPr>
+        <w:pStyle w:val="Heading3"/>
+      </w:pPr>
+      <w:r>
+        <w:t>Things people forget</w:t>
+      </w:r>
+    </w:p>
+    <w:p>
+      <w:pPr>
+        <w:spacing w:after="120"/>
+      </w:pPr>
+      <w:r>
+        <w:t>Only base rent is prorated. The utilities and Wi-Fi share is added in full on every bill (when not included in rent).</w:t>
+      </w:r>
+    </w:p>
+    <w:p>
+      <w:pPr>
+        <w:spacing w:after="120"/>
+      </w:pPr>
+      <w:r>
+        <w:t>Changing a setting does not touch bills already issued. Bills keep the amounts they were created with; the new rule applies from the next generated bill.</w:t>
+      </w:r>
+    </w:p>
+    <w:p>
+      <w:pPr>
+        <w:spacing w:after="120"/>
+      </w:pPr>
+      <w:r>
+        <w:rPr>
+          <w:b/>
+          <w:bCs/>
+          <w:color w:val="197335"/>
+        </w:rPr>
+        <w:t xml:space="preserve">Where the code is: </w:t>
+      </w:r>
+      <w:r>
+        <w:t>app/Http/Controllers/Api/BillingController.php  (generateForContract, rentForPeriod, startDatePeriod, endsMidMonthAtContractEnd), app/Models/DormitoryProfile.php (defaults), migration 2026_10_06_000001_add_mid_month_move_out_to_dormitory_profile.php</w:t>
+      </w:r>
+    </w:p>
+    <w:p>
+      <w:pPr>
+        <w:spacing w:after="120"/>
+      </w:pPr>
+      <w:r>
+        <w:rPr>
+          <w:b/>
+          <w:bCs/>
+          <w:color w:val="197335"/>
+        </w:rPr>
+        <w:t xml:space="preserve">In plain words: </w:t>
+      </w:r>
+      <w:r>
+        <w:t>Pureza's rule (full month for move-in) is the default. If a dorm wants fairer billing, the admin flips one dropdown; the code already handles both ways.</w:t>
+      </w:r>
+    </w:p>
+    <w:p>
+      <w:pPr>
+        <w:spacing w:after="120"/>
+      </w:pPr>
+    </w:p>
+    <w:p>
+      <w:pPr>
         <w:pStyle w:val="Heading3"/>
       </w:pPr>
       <w:r>
@@ -9078,7 +9204,6 @@
           <w:b/>
           <w:bCs/>
         </w:rPr>
-        <w:lastRenderedPageBreak/>
         <w:t xml:space="preserve">A: </w:t>
       </w:r>
       <w:r>
@@ -9123,25 +9248,168 @@
     </w:p>
     <w:p>
       <w:pPr>
+        <w:spacing w:before="100" w:after="40"/>
+      </w:pPr>
+      <w:r>
+        <w:rPr>
+          <w:b/>
+          <w:bCs/>
+          <w:color w:val="197335"/>
+        </w:rPr>
+        <w:t xml:space="preserve">Q: </w:t>
+      </w:r>
+      <w:r>
+        <w:rPr>
+          <w:b/>
+          <w:bCs/>
+        </w:rPr>
+        <w:t>A tenant moves in on the 20th. Do they pay for a full month?</w:t>
+      </w:r>
+    </w:p>
+    <w:p>
+      <w:pPr>
+        <w:spacing w:after="100"/>
+        <w:ind w:left="360"/>
+      </w:pPr>
+      <w:r>
+        <w:rPr>
+          <w:b/>
+          <w:bCs/>
+        </w:rPr>
+        <w:t xml:space="preserve">A: </w:t>
+      </w:r>
+      <w:r>
+        <w:t>By default yes: the advance rent covers the move-in month. If "Mid-month move-in" is set to Prorated, the 19 unused days are credited on their first monthly bill.</w:t>
+      </w:r>
+    </w:p>
+    <w:p>
+      <w:pPr>
+        <w:spacing w:before="100" w:after="40"/>
+      </w:pPr>
+      <w:r>
+        <w:rPr>
+          <w:b/>
+          <w:bCs/>
+          <w:color w:val="197335"/>
+        </w:rPr>
+        <w:t xml:space="preserve">Q: </w:t>
+      </w:r>
+      <w:r>
+        <w:rPr>
+          <w:b/>
+          <w:bCs/>
+        </w:rPr>
+        <w:t>How is the daily rate computed?</w:t>
+      </w:r>
+    </w:p>
+    <w:p>
+      <w:pPr>
+        <w:spacing w:after="100"/>
+        <w:ind w:left="360"/>
+      </w:pPr>
+      <w:r>
+        <w:rPr>
+          <w:b/>
+          <w:bCs/>
+        </w:rPr>
+        <w:t xml:space="preserve">A: </w:t>
+      </w:r>
+      <w:r>
+        <w:t>Monthly rate ÷ days in that specific month, so a day in February costs more than a day in March. Results are rounded to 2 decimals.</w:t>
+      </w:r>
+    </w:p>
+    <w:p>
+      <w:pPr>
+        <w:spacing w:before="100" w:after="40"/>
+      </w:pPr>
+      <w:r>
+        <w:rPr>
+          <w:b/>
+          <w:bCs/>
+          <w:color w:val="197335"/>
+        </w:rPr>
+        <w:t xml:space="preserve">Q: </w:t>
+      </w:r>
+      <w:r>
+        <w:rPr>
+          <w:b/>
+          <w:bCs/>
+        </w:rPr>
+        <w:t>What happens if the contract ends on the 10th?</w:t>
+      </w:r>
+    </w:p>
+    <w:p>
+      <w:pPr>
+        <w:spacing w:after="100"/>
+        <w:ind w:left="360"/>
+      </w:pPr>
+      <w:r>
+        <w:rPr>
+          <w:b/>
+          <w:bCs/>
+        </w:rPr>
+        <w:t xml:space="preserve">A: </w:t>
+      </w:r>
+      <w:r>
+        <w:t>By default the last bill charges only 10 days. If "Mid-month move-out" is set to Charged in full, the whole month is billed.</w:t>
+      </w:r>
+    </w:p>
+    <w:p>
+      <w:pPr>
+        <w:spacing w:before="100" w:after="40"/>
+      </w:pPr>
+      <w:r>
+        <w:rPr>
+          <w:b/>
+          <w:bCs/>
+          <w:color w:val="197335"/>
+        </w:rPr>
+        <w:t xml:space="preserve">Q: </w:t>
+      </w:r>
+      <w:r>
+        <w:rPr>
+          <w:b/>
+          <w:bCs/>
+        </w:rPr>
+        <w:t>Are utilities prorated too?</w:t>
+      </w:r>
+    </w:p>
+    <w:p>
+      <w:pPr>
+        <w:spacing w:after="100"/>
+        <w:ind w:left="360"/>
+      </w:pPr>
+      <w:r>
+        <w:rPr>
+          <w:b/>
+          <w:bCs/>
+        </w:rPr>
+        <w:t xml:space="preserve">A: </w:t>
+      </w:r>
+      <w:r>
+        <w:t>No. Only rent is prorated; the utility and Wi-Fi share is a fixed monthly amount per bed.</w:t>
+      </w:r>
+    </w:p>
+    <w:p>
+      <w:pPr>
         <w:pStyle w:val="Heading1"/>
         <w:pageBreakBefore/>
       </w:pPr>
-      <w:bookmarkStart w:id="27" w:name="_Toc242127683"/>
-      <w:r>
-        <w:lastRenderedPageBreak/>
+      <w:bookmarkStart w:id="28" w:name="_Toc242144182"/>
+      <w:r>
         <w:t>10. Paying bills: proof upload, approval, cash</w:t>
       </w:r>
-      <w:bookmarkEnd w:id="27"/>
+      <w:bookmarkEnd w:id="28"/>
     </w:p>
     <w:p>
       <w:pPr>
         <w:pStyle w:val="Heading2"/>
       </w:pPr>
-      <w:bookmarkStart w:id="28" w:name="_Toc242127684"/>
+      <w:bookmarkStart w:id="29" w:name="_Toc242144183"/>
       <w:r>
         <w:t>What it does</w:t>
       </w:r>
-      <w:bookmarkEnd w:id="28"/>
+      <w:bookmarkEnd w:id="29"/>
     </w:p>
     <w:p>
       <w:pPr>
@@ -9155,11 +9423,11 @@
       <w:pPr>
         <w:pStyle w:val="Heading2"/>
       </w:pPr>
-      <w:bookmarkStart w:id="29" w:name="_Toc242127685"/>
+      <w:bookmarkStart w:id="30" w:name="_Toc242144184"/>
       <w:r>
         <w:t>How it works</w:t>
       </w:r>
-      <w:bookmarkEnd w:id="29"/>
+      <w:bookmarkEnd w:id="30"/>
     </w:p>
     <w:p>
       <w:pPr>
@@ -9361,12 +9629,6 @@
         <w:gridCol w:w="9360"/>
       </w:tblGrid>
       <w:tr>
-        <w:tblPrEx>
-          <w:tblCellMar>
-            <w:top w:w="0" w:type="dxa"/>
-            <w:bottom w:w="0" w:type="dxa"/>
-          </w:tblCellMar>
-        </w:tblPrEx>
         <w:tc>
           <w:tcPr>
             <w:tcW w:w="9360" w:type="dxa"/>
@@ -9557,22 +9819,21 @@
         <w:pStyle w:val="Heading1"/>
         <w:pageBreakBefore/>
       </w:pPr>
-      <w:bookmarkStart w:id="30" w:name="_Toc242127686"/>
-      <w:r>
-        <w:lastRenderedPageBreak/>
+      <w:bookmarkStart w:id="31" w:name="_Toc242144185"/>
+      <w:r>
         <w:t>11. Grace period and late penalty</w:t>
       </w:r>
-      <w:bookmarkEnd w:id="30"/>
+      <w:bookmarkEnd w:id="31"/>
     </w:p>
     <w:p>
       <w:pPr>
         <w:pStyle w:val="Heading2"/>
       </w:pPr>
-      <w:bookmarkStart w:id="31" w:name="_Toc242127687"/>
+      <w:bookmarkStart w:id="32" w:name="_Toc242144186"/>
       <w:r>
         <w:t>What it does</w:t>
       </w:r>
-      <w:bookmarkEnd w:id="31"/>
+      <w:bookmarkEnd w:id="32"/>
     </w:p>
     <w:p>
       <w:pPr>
@@ -9616,11 +9877,11 @@
       <w:pPr>
         <w:pStyle w:val="Heading2"/>
       </w:pPr>
-      <w:bookmarkStart w:id="32" w:name="_Toc242127688"/>
+      <w:bookmarkStart w:id="33" w:name="_Toc242144187"/>
       <w:r>
         <w:t>How it works</w:t>
       </w:r>
-      <w:bookmarkEnd w:id="32"/>
+      <w:bookmarkEnd w:id="33"/>
     </w:p>
     <w:p>
       <w:pPr>
@@ -9812,12 +10073,6 @@
         <w:gridCol w:w="9360"/>
       </w:tblGrid>
       <w:tr>
-        <w:tblPrEx>
-          <w:tblCellMar>
-            <w:top w:w="0" w:type="dxa"/>
-            <w:bottom w:w="0" w:type="dxa"/>
-          </w:tblCellMar>
-        </w:tblPrEx>
         <w:tc>
           <w:tcPr>
             <w:tcW w:w="9360" w:type="dxa"/>
@@ -9942,22 +10197,21 @@
         <w:pStyle w:val="Heading1"/>
         <w:pageBreakBefore/>
       </w:pPr>
-      <w:bookmarkStart w:id="33" w:name="_Toc242127689"/>
-      <w:r>
-        <w:lastRenderedPageBreak/>
+      <w:bookmarkStart w:id="34" w:name="_Toc242144188"/>
+      <w:r>
         <w:t>12. Late-payment follow-up (6-stage delinquency escalation)</w:t>
       </w:r>
-      <w:bookmarkEnd w:id="33"/>
+      <w:bookmarkEnd w:id="34"/>
     </w:p>
     <w:p>
       <w:pPr>
         <w:pStyle w:val="Heading2"/>
       </w:pPr>
-      <w:bookmarkStart w:id="34" w:name="_Toc242127690"/>
+      <w:bookmarkStart w:id="35" w:name="_Toc242144189"/>
       <w:r>
         <w:t>What it does</w:t>
       </w:r>
-      <w:bookmarkEnd w:id="34"/>
+      <w:bookmarkEnd w:id="35"/>
     </w:p>
     <w:p>
       <w:pPr>
@@ -9990,12 +10244,6 @@
         <w:gridCol w:w="4760"/>
       </w:tblGrid>
       <w:tr>
-        <w:tblPrEx>
-          <w:tblCellMar>
-            <w:top w:w="0" w:type="dxa"/>
-            <w:bottom w:w="0" w:type="dxa"/>
-          </w:tblCellMar>
-        </w:tblPrEx>
         <w:trPr>
           <w:tblHeader/>
         </w:trPr>
@@ -10082,12 +10330,6 @@
         </w:tc>
       </w:tr>
       <w:tr>
-        <w:tblPrEx>
-          <w:tblCellMar>
-            <w:top w:w="0" w:type="dxa"/>
-            <w:bottom w:w="0" w:type="dxa"/>
-          </w:tblCellMar>
-        </w:tblPrEx>
         <w:tc>
           <w:tcPr>
             <w:tcW w:w="2200" w:type="dxa"/>
@@ -10156,12 +10398,6 @@
         </w:tc>
       </w:tr>
       <w:tr>
-        <w:tblPrEx>
-          <w:tblCellMar>
-            <w:top w:w="0" w:type="dxa"/>
-            <w:bottom w:w="0" w:type="dxa"/>
-          </w:tblCellMar>
-        </w:tblPrEx>
         <w:tc>
           <w:tcPr>
             <w:tcW w:w="2200" w:type="dxa"/>
@@ -10230,12 +10466,6 @@
         </w:tc>
       </w:tr>
       <w:tr>
-        <w:tblPrEx>
-          <w:tblCellMar>
-            <w:top w:w="0" w:type="dxa"/>
-            <w:bottom w:w="0" w:type="dxa"/>
-          </w:tblCellMar>
-        </w:tblPrEx>
         <w:tc>
           <w:tcPr>
             <w:tcW w:w="2200" w:type="dxa"/>
@@ -10304,12 +10534,6 @@
         </w:tc>
       </w:tr>
       <w:tr>
-        <w:tblPrEx>
-          <w:tblCellMar>
-            <w:top w:w="0" w:type="dxa"/>
-            <w:bottom w:w="0" w:type="dxa"/>
-          </w:tblCellMar>
-        </w:tblPrEx>
         <w:tc>
           <w:tcPr>
             <w:tcW w:w="2200" w:type="dxa"/>
@@ -10378,12 +10602,6 @@
         </w:tc>
       </w:tr>
       <w:tr>
-        <w:tblPrEx>
-          <w:tblCellMar>
-            <w:top w:w="0" w:type="dxa"/>
-            <w:bottom w:w="0" w:type="dxa"/>
-          </w:tblCellMar>
-        </w:tblPrEx>
         <w:tc>
           <w:tcPr>
             <w:tcW w:w="2200" w:type="dxa"/>
@@ -10452,12 +10670,6 @@
         </w:tc>
       </w:tr>
       <w:tr>
-        <w:tblPrEx>
-          <w:tblCellMar>
-            <w:top w:w="0" w:type="dxa"/>
-            <w:bottom w:w="0" w:type="dxa"/>
-          </w:tblCellMar>
-        </w:tblPrEx>
         <w:tc>
           <w:tcPr>
             <w:tcW w:w="2200" w:type="dxa"/>
@@ -10552,12 +10764,6 @@
         <w:gridCol w:w="9360"/>
       </w:tblGrid>
       <w:tr>
-        <w:tblPrEx>
-          <w:tblCellMar>
-            <w:top w:w="0" w:type="dxa"/>
-            <w:bottom w:w="0" w:type="dxa"/>
-          </w:tblCellMar>
-        </w:tblPrEx>
         <w:tc>
           <w:tcPr>
             <w:tcW w:w="9360" w:type="dxa"/>
@@ -10614,11 +10820,11 @@
       <w:pPr>
         <w:pStyle w:val="Heading2"/>
       </w:pPr>
-      <w:bookmarkStart w:id="35" w:name="_Toc242127691"/>
+      <w:bookmarkStart w:id="36" w:name="_Toc242144190"/>
       <w:r>
         <w:t>How it works</w:t>
       </w:r>
-      <w:bookmarkEnd w:id="35"/>
+      <w:bookmarkEnd w:id="36"/>
     </w:p>
     <w:p>
       <w:pPr>
@@ -10756,7 +10962,6 @@
         <w:spacing w:after="120"/>
       </w:pPr>
       <w:r>
-        <w:lastRenderedPageBreak/>
         <w:t>The guard that blocks restricted tenants is a middleware: if portal_restricted is true, every page except Billing, Delinquency, notifications and logout redirects to Billing.</w:t>
       </w:r>
     </w:p>
@@ -10817,12 +11022,6 @@
         <w:gridCol w:w="9360"/>
       </w:tblGrid>
       <w:tr>
-        <w:tblPrEx>
-          <w:tblCellMar>
-            <w:top w:w="0" w:type="dxa"/>
-            <w:bottom w:w="0" w:type="dxa"/>
-          </w:tblCellMar>
-        </w:tblPrEx>
         <w:tc>
           <w:tcPr>
             <w:tcW w:w="9360" w:type="dxa"/>
@@ -11125,22 +11324,21 @@
         <w:pStyle w:val="Heading1"/>
         <w:pageBreakBefore/>
       </w:pPr>
-      <w:bookmarkStart w:id="36" w:name="_Toc242127692"/>
-      <w:r>
-        <w:lastRenderedPageBreak/>
+      <w:bookmarkStart w:id="37" w:name="_Toc242144191"/>
+      <w:r>
         <w:t>13. Maintenance tickets and automatic priority</w:t>
       </w:r>
-      <w:bookmarkEnd w:id="36"/>
+      <w:bookmarkEnd w:id="37"/>
     </w:p>
     <w:p>
       <w:pPr>
         <w:pStyle w:val="Heading2"/>
       </w:pPr>
-      <w:bookmarkStart w:id="37" w:name="_Toc242127693"/>
+      <w:bookmarkStart w:id="38" w:name="_Toc242144192"/>
       <w:r>
         <w:t>What it does</w:t>
       </w:r>
-      <w:bookmarkEnd w:id="37"/>
+      <w:bookmarkEnd w:id="38"/>
     </w:p>
     <w:p>
       <w:pPr>
@@ -11174,11 +11372,11 @@
       <w:pPr>
         <w:pStyle w:val="Heading2"/>
       </w:pPr>
-      <w:bookmarkStart w:id="38" w:name="_Toc242127694"/>
+      <w:bookmarkStart w:id="39" w:name="_Toc242144193"/>
       <w:r>
         <w:t>How it works (rule-based, in English and Filipino)</w:t>
       </w:r>
-      <w:bookmarkEnd w:id="38"/>
+      <w:bookmarkEnd w:id="39"/>
     </w:p>
     <w:p>
       <w:pPr>
@@ -11418,22 +11616,21 @@
         <w:pStyle w:val="Heading1"/>
         <w:pageBreakBefore/>
       </w:pPr>
-      <w:bookmarkStart w:id="39" w:name="_Toc242127695"/>
-      <w:r>
-        <w:lastRenderedPageBreak/>
+      <w:bookmarkStart w:id="40" w:name="_Toc242144194"/>
+      <w:r>
         <w:t>14. Reviews and automatic moderation</w:t>
       </w:r>
-      <w:bookmarkEnd w:id="39"/>
+      <w:bookmarkEnd w:id="40"/>
     </w:p>
     <w:p>
       <w:pPr>
         <w:pStyle w:val="Heading2"/>
       </w:pPr>
-      <w:bookmarkStart w:id="40" w:name="_Toc242127696"/>
+      <w:bookmarkStart w:id="41" w:name="_Toc242144195"/>
       <w:r>
         <w:t>What it does</w:t>
       </w:r>
-      <w:bookmarkEnd w:id="40"/>
+      <w:bookmarkEnd w:id="41"/>
     </w:p>
     <w:p>
       <w:pPr>
@@ -11457,11 +11654,11 @@
       <w:pPr>
         <w:pStyle w:val="Heading2"/>
       </w:pPr>
-      <w:bookmarkStart w:id="41" w:name="_Toc242127697"/>
+      <w:bookmarkStart w:id="42" w:name="_Toc242144196"/>
       <w:r>
         <w:t>What it checks</w:t>
       </w:r>
-      <w:bookmarkEnd w:id="41"/>
+      <w:bookmarkEnd w:id="42"/>
     </w:p>
     <w:p>
       <w:pPr>
@@ -11542,12 +11739,11 @@
         <w:pStyle w:val="Heading1"/>
         <w:pageBreakBefore/>
       </w:pPr>
-      <w:bookmarkStart w:id="42" w:name="_Toc242127698"/>
-      <w:r>
-        <w:lastRenderedPageBreak/>
+      <w:bookmarkStart w:id="43" w:name="_Toc242144197"/>
+      <w:r>
         <w:t>15. Notifications, SMS and email</w:t>
       </w:r>
-      <w:bookmarkEnd w:id="42"/>
+      <w:bookmarkEnd w:id="43"/>
     </w:p>
     <w:tbl>
       <w:tblPr>
@@ -11572,12 +11768,6 @@
         <w:gridCol w:w="4155"/>
       </w:tblGrid>
       <w:tr>
-        <w:tblPrEx>
-          <w:tblCellMar>
-            <w:top w:w="0" w:type="dxa"/>
-            <w:bottom w:w="0" w:type="dxa"/>
-          </w:tblCellMar>
-        </w:tblPrEx>
         <w:trPr>
           <w:tblHeader/>
         </w:trPr>
@@ -11664,12 +11854,6 @@
         </w:tc>
       </w:tr>
       <w:tr>
-        <w:tblPrEx>
-          <w:tblCellMar>
-            <w:top w:w="0" w:type="dxa"/>
-            <w:bottom w:w="0" w:type="dxa"/>
-          </w:tblCellMar>
-        </w:tblPrEx>
         <w:tc>
           <w:tcPr>
             <w:tcW w:w="1800" w:type="dxa"/>
@@ -11738,12 +11922,6 @@
         </w:tc>
       </w:tr>
       <w:tr>
-        <w:tblPrEx>
-          <w:tblCellMar>
-            <w:top w:w="0" w:type="dxa"/>
-            <w:bottom w:w="0" w:type="dxa"/>
-          </w:tblCellMar>
-        </w:tblPrEx>
         <w:tc>
           <w:tcPr>
             <w:tcW w:w="1800" w:type="dxa"/>
@@ -11812,12 +11990,6 @@
         </w:tc>
       </w:tr>
       <w:tr>
-        <w:tblPrEx>
-          <w:tblCellMar>
-            <w:top w:w="0" w:type="dxa"/>
-            <w:bottom w:w="0" w:type="dxa"/>
-          </w:tblCellMar>
-        </w:tblPrEx>
         <w:tc>
           <w:tcPr>
             <w:tcW w:w="1800" w:type="dxa"/>
@@ -11886,12 +12058,6 @@
         </w:tc>
       </w:tr>
       <w:tr>
-        <w:tblPrEx>
-          <w:tblCellMar>
-            <w:top w:w="0" w:type="dxa"/>
-            <w:bottom w:w="0" w:type="dxa"/>
-          </w:tblCellMar>
-        </w:tblPrEx>
         <w:tc>
           <w:tcPr>
             <w:tcW w:w="1800" w:type="dxa"/>
@@ -11978,22 +12144,21 @@
         <w:pStyle w:val="Heading1"/>
         <w:pageBreakBefore/>
       </w:pPr>
-      <w:bookmarkStart w:id="43" w:name="_Toc242127699"/>
-      <w:r>
-        <w:lastRenderedPageBreak/>
+      <w:bookmarkStart w:id="44" w:name="_Toc242144198"/>
+      <w:r>
         <w:t>16. Reports and forecasting</w:t>
       </w:r>
-      <w:bookmarkEnd w:id="43"/>
+      <w:bookmarkEnd w:id="44"/>
     </w:p>
     <w:p>
       <w:pPr>
         <w:pStyle w:val="Heading2"/>
       </w:pPr>
-      <w:bookmarkStart w:id="44" w:name="_Toc242127700"/>
+      <w:bookmarkStart w:id="45" w:name="_Toc242144199"/>
       <w:r>
         <w:t>What it does</w:t>
       </w:r>
-      <w:bookmarkEnd w:id="44"/>
+      <w:bookmarkEnd w:id="45"/>
     </w:p>
     <w:p>
       <w:pPr>
@@ -12047,11 +12212,11 @@
       <w:pPr>
         <w:pStyle w:val="Heading2"/>
       </w:pPr>
-      <w:bookmarkStart w:id="45" w:name="_Toc242127701"/>
+      <w:bookmarkStart w:id="46" w:name="_Toc242144200"/>
       <w:r>
         <w:t>How the forecast works (simple averages, no AI)</w:t>
       </w:r>
-      <w:bookmarkEnd w:id="45"/>
+      <w:bookmarkEnd w:id="46"/>
     </w:p>
     <w:p>
       <w:pPr>
@@ -12251,22 +12416,21 @@
         <w:pStyle w:val="Heading1"/>
         <w:pageBreakBefore/>
       </w:pPr>
-      <w:bookmarkStart w:id="46" w:name="_Toc242127702"/>
-      <w:r>
-        <w:lastRenderedPageBreak/>
+      <w:bookmarkStart w:id="47" w:name="_Toc242144201"/>
+      <w:r>
         <w:t>17. Tenant records, move-out and dorm settings</w:t>
       </w:r>
-      <w:bookmarkEnd w:id="46"/>
+      <w:bookmarkEnd w:id="47"/>
     </w:p>
     <w:p>
       <w:pPr>
         <w:pStyle w:val="Heading2"/>
       </w:pPr>
-      <w:bookmarkStart w:id="47" w:name="_Toc242127703"/>
+      <w:bookmarkStart w:id="48" w:name="_Toc242144202"/>
       <w:r>
         <w:t>Tenant Manager</w:t>
       </w:r>
-      <w:bookmarkEnd w:id="47"/>
+      <w:bookmarkEnd w:id="48"/>
     </w:p>
     <w:p>
       <w:pPr>
@@ -12321,11 +12485,11 @@
       <w:pPr>
         <w:pStyle w:val="Heading2"/>
       </w:pPr>
-      <w:bookmarkStart w:id="48" w:name="_Toc242127704"/>
+      <w:bookmarkStart w:id="49" w:name="_Toc242144203"/>
       <w:r>
         <w:t>Moved-out tenants</w:t>
       </w:r>
-      <w:bookmarkEnd w:id="48"/>
+      <w:bookmarkEnd w:id="49"/>
     </w:p>
     <w:p>
       <w:pPr>
@@ -12349,11 +12513,11 @@
       <w:pPr>
         <w:pStyle w:val="Heading2"/>
       </w:pPr>
-      <w:bookmarkStart w:id="49" w:name="_Toc242127705"/>
+      <w:bookmarkStart w:id="50" w:name="_Toc242144204"/>
       <w:r>
         <w:t>Dormitory Profile (settings)</w:t>
       </w:r>
-      <w:bookmarkEnd w:id="49"/>
+      <w:bookmarkEnd w:id="50"/>
     </w:p>
     <w:p>
       <w:pPr>
@@ -12388,11 +12552,11 @@
       <w:pPr>
         <w:pStyle w:val="Heading2"/>
       </w:pPr>
-      <w:bookmarkStart w:id="50" w:name="_Toc242127706"/>
+      <w:bookmarkStart w:id="51" w:name="_Toc242144205"/>
       <w:r>
         <w:t>Activity Log</w:t>
       </w:r>
-      <w:bookmarkEnd w:id="50"/>
+      <w:bookmarkEnd w:id="51"/>
     </w:p>
     <w:p>
       <w:pPr>
@@ -12428,12 +12592,11 @@
         <w:pStyle w:val="Heading1"/>
         <w:pageBreakBefore/>
       </w:pPr>
-      <w:bookmarkStart w:id="51" w:name="_Toc242127707"/>
-      <w:r>
-        <w:lastRenderedPageBreak/>
+      <w:bookmarkStart w:id="52" w:name="_Toc242144206"/>
+      <w:r>
         <w:t>18. Everything that runs automatically every day</w:t>
       </w:r>
-      <w:bookmarkEnd w:id="51"/>
+      <w:bookmarkEnd w:id="52"/>
     </w:p>
     <w:tbl>
       <w:tblPr>
@@ -12458,12 +12621,6 @@
         <w:gridCol w:w="5333"/>
       </w:tblGrid>
       <w:tr>
-        <w:tblPrEx>
-          <w:tblCellMar>
-            <w:top w:w="0" w:type="dxa"/>
-            <w:bottom w:w="0" w:type="dxa"/>
-          </w:tblCellMar>
-        </w:tblPrEx>
         <w:trPr>
           <w:tblHeader/>
         </w:trPr>
@@ -12550,12 +12707,6 @@
         </w:tc>
       </w:tr>
       <w:tr>
-        <w:tblPrEx>
-          <w:tblCellMar>
-            <w:top w:w="0" w:type="dxa"/>
-            <w:bottom w:w="0" w:type="dxa"/>
-          </w:tblCellMar>
-        </w:tblPrEx>
         <w:tc>
           <w:tcPr>
             <w:tcW w:w="2400" w:type="dxa"/>
@@ -12624,12 +12775,6 @@
         </w:tc>
       </w:tr>
       <w:tr>
-        <w:tblPrEx>
-          <w:tblCellMar>
-            <w:top w:w="0" w:type="dxa"/>
-            <w:bottom w:w="0" w:type="dxa"/>
-          </w:tblCellMar>
-        </w:tblPrEx>
         <w:tc>
           <w:tcPr>
             <w:tcW w:w="2400" w:type="dxa"/>
@@ -12698,12 +12843,6 @@
         </w:tc>
       </w:tr>
       <w:tr>
-        <w:tblPrEx>
-          <w:tblCellMar>
-            <w:top w:w="0" w:type="dxa"/>
-            <w:bottom w:w="0" w:type="dxa"/>
-          </w:tblCellMar>
-        </w:tblPrEx>
         <w:tc>
           <w:tcPr>
             <w:tcW w:w="2400" w:type="dxa"/>
@@ -12772,12 +12911,6 @@
         </w:tc>
       </w:tr>
       <w:tr>
-        <w:tblPrEx>
-          <w:tblCellMar>
-            <w:top w:w="0" w:type="dxa"/>
-            <w:bottom w:w="0" w:type="dxa"/>
-          </w:tblCellMar>
-        </w:tblPrEx>
         <w:tc>
           <w:tcPr>
             <w:tcW w:w="2400" w:type="dxa"/>
@@ -12884,12 +13017,11 @@
         <w:pStyle w:val="Heading1"/>
         <w:pageBreakBefore/>
       </w:pPr>
-      <w:bookmarkStart w:id="52" w:name="_Toc242127708"/>
-      <w:r>
-        <w:lastRenderedPageBreak/>
+      <w:bookmarkStart w:id="53" w:name="_Toc242144207"/>
+      <w:r>
         <w:t>19. Security and data protection, in short</w:t>
       </w:r>
-      <w:bookmarkEnd w:id="52"/>
+      <w:bookmarkEnd w:id="53"/>
     </w:p>
     <w:p>
       <w:pPr>
@@ -13096,12 +13228,11 @@
         <w:pStyle w:val="Heading1"/>
         <w:pageBreakBefore/>
       </w:pPr>
-      <w:bookmarkStart w:id="53" w:name="_Toc242127709"/>
-      <w:r>
-        <w:lastRenderedPageBreak/>
+      <w:bookmarkStart w:id="54" w:name="_Toc242144208"/>
+      <w:r>
         <w:t>20. Limitations and honest answers</w:t>
       </w:r>
-      <w:bookmarkEnd w:id="53"/>
+      <w:bookmarkEnd w:id="54"/>
     </w:p>
     <w:p>
       <w:pPr>
@@ -13241,7 +13372,7 @@
         <w:spacing w:after="60"/>
       </w:pPr>
       <w:r>
-        <w:t>Open decisions with Pureza: the returning-tenant discount, utilities included or not, mid-month proration.</w:t>
+        <w:t>Open decisions with Pureza: the returning-tenant discount and utilities included or not. Mid-month proration is no longer open code-wise: move-in and move-out are separate settings, so whatever Pureza confirms is one dropdown change.</w:t>
       </w:r>
     </w:p>
     <w:p>
@@ -13249,12 +13380,11 @@
         <w:pStyle w:val="Heading1"/>
         <w:pageBreakBefore/>
       </w:pPr>
-      <w:bookmarkStart w:id="54" w:name="_Toc242127710"/>
-      <w:r>
-        <w:lastRenderedPageBreak/>
+      <w:bookmarkStart w:id="55" w:name="_Toc242144209"/>
+      <w:r>
         <w:t>21. Quick-answer sheet</w:t>
       </w:r>
-      <w:bookmarkEnd w:id="54"/>
+      <w:bookmarkEnd w:id="55"/>
     </w:p>
     <w:p>
       <w:pPr>

</xml_diff>